<commit_message>
podstawy kółko i krzyżyk
</commit_message>
<xml_diff>
--- a/dokumentacja.docx
+++ b/dokumentacja.docx
@@ -1,81 +1,82 @@
 
 <file path=word/document.xml><?xml version="1.0" encoding="utf-8"?>
-<w:document xmlns:w14="http://schemas.microsoft.com/office/word/2010/wordml" xmlns:wp14="http://schemas.microsoft.com/office/word/2010/wordprocessingDrawing" xmlns:ve="http://schemas.openxmlformats.org/markup-compatibility/2006" xmlns:o="urn:schemas-microsoft-com:office:office" xmlns:r="http://schemas.openxmlformats.org/officeDocument/2006/relationships" xmlns:m="http://schemas.openxmlformats.org/officeDocument/2006/math" xmlns:v="urn:schemas-microsoft-com:vml" xmlns:wp="http://schemas.openxmlformats.org/drawingml/2006/wordprocessingDrawing" xmlns:w10="urn:schemas-microsoft-com:office:word" xmlns:w="http://schemas.openxmlformats.org/wordprocessingml/2006/main" xmlns:wne="http://schemas.microsoft.com/office/word/2006/wordml" xmlns:mc="http://schemas.openxmlformats.org/markup-compatibility/2006" mc:Ignorable="w14 wp14">
+<w:document xmlns:wpc="http://schemas.microsoft.com/office/word/2010/wordprocessingCanvas" xmlns:cx="http://schemas.microsoft.com/office/drawing/2014/chartex" xmlns:cx1="http://schemas.microsoft.com/office/drawing/2015/9/8/chartex" xmlns:cx2="http://schemas.microsoft.com/office/drawing/2015/10/21/chartex" xmlns:cx3="http://schemas.microsoft.com/office/drawing/2016/5/9/chartex" xmlns:cx4="http://schemas.microsoft.com/office/drawing/2016/5/10/chartex" xmlns:cx5="http://schemas.microsoft.com/office/drawing/2016/5/11/chartex" xmlns:cx6="http://schemas.microsoft.com/office/drawing/2016/5/12/chartex" xmlns:cx7="http://schemas.microsoft.com/office/drawing/2016/5/13/chartex" xmlns:cx8="http://schemas.microsoft.com/office/drawing/2016/5/14/chartex" xmlns:mc="http://schemas.openxmlformats.org/markup-compatibility/2006" xmlns:aink="http://schemas.microsoft.com/office/drawing/2016/ink" xmlns:am3d="http://schemas.microsoft.com/office/drawing/2017/model3d" xmlns:o="urn:schemas-microsoft-com:office:office" xmlns:oel="http://schemas.microsoft.com/office/2019/extlst" xmlns:r="http://schemas.openxmlformats.org/officeDocument/2006/relationships" xmlns:m="http://schemas.openxmlformats.org/officeDocument/2006/math" xmlns:v="urn:schemas-microsoft-com:vml" xmlns:wp14="http://schemas.microsoft.com/office/word/2010/wordprocessingDrawing" xmlns:wp="http://schemas.openxmlformats.org/drawingml/2006/wordprocessingDrawing" xmlns:w10="urn:schemas-microsoft-com:office:word" xmlns:w="http://schemas.openxmlformats.org/wordprocessingml/2006/main" xmlns:w14="http://schemas.microsoft.com/office/word/2010/wordml" xmlns:w15="http://schemas.microsoft.com/office/word/2012/wordml" xmlns:w16cex="http://schemas.microsoft.com/office/word/2018/wordml/cex" xmlns:w16cid="http://schemas.microsoft.com/office/word/2016/wordml/cid" xmlns:w16="http://schemas.microsoft.com/office/word/2018/wordml" xmlns:w16du="http://schemas.microsoft.com/office/word/2023/wordml/word16du" xmlns:w16sdtdh="http://schemas.microsoft.com/office/word/2020/wordml/sdtdatahash" xmlns:w16sdtfl="http://schemas.microsoft.com/office/word/2024/wordml/sdtformatlock" xmlns:w16se="http://schemas.microsoft.com/office/word/2015/wordml/symex" xmlns:wpg="http://schemas.microsoft.com/office/word/2010/wordprocessingGroup" xmlns:wpi="http://schemas.microsoft.com/office/word/2010/wordprocessingInk" xmlns:wne="http://schemas.microsoft.com/office/word/2006/wordml" xmlns:wps="http://schemas.microsoft.com/office/word/2010/wordprocessingShape" mc:Ignorable="w14 w15 w16se w16cid w16 w16cex w16sdtdh w16sdtfl w16du wp14">
   <w:body>
-    <w:p xmlns:wp14="http://schemas.microsoft.com/office/word/2010/wordml" wp14:textId="77777777">
+    <w:p>
       <w:r>
         <w:t>28 maja-  start projektu</w:t>
       </w:r>
     </w:p>
     <w:p>
       <w:r>
+        <w:t>Cele:  Moja gra</w:t>
+      </w:r>
+      <w:r>
+        <w:t xml:space="preserve"> to </w:t>
+      </w:r>
+      <w:r>
+        <w:t>b</w:t>
+      </w:r>
+      <w:r>
+        <w:t>ę</w:t>
+      </w:r>
+      <w:r>
+        <w:t>dzie</w:t>
+      </w:r>
+      <w:r>
+        <w:t xml:space="preserve"> </w:t>
+      </w:r>
+      <w:r>
+        <w:t>“Salon Gier”- kilka prostych, klasycznych gier.</w:t>
+      </w:r>
+    </w:p>
+    <w:p>
+      <w:r>
+        <w:t>Przede wszystkim z:</w:t>
+      </w:r>
+    </w:p>
+    <w:p>
+      <w:r>
+        <w:t>1. Kółko i krzyżyk</w:t>
+      </w:r>
+    </w:p>
+    <w:p>
+      <w:r>
+        <w:t>2. Blackjack</w:t>
+      </w:r>
+    </w:p>
+    <w:p>
+      <w:r>
+        <w:t xml:space="preserve">30 maja – Start pracy nad menu głównym projektu. </w:t>
+      </w:r>
+    </w:p>
+    <w:p>
+      <w:pPr>
+        <w:pStyle w:val="Akapitzlist"/>
+        <w:numPr>
+          <w:ilvl w:val="0"/>
+          <w:numId w:val="2"/>
+        </w:numPr>
+        <w:rPr>
+          <w:rStyle w:val="Hipercze"/>
+        </w:rPr>
+      </w:pPr>
+      <w:r>
         <w:rPr/>
-        <w:t>Cele:  Moja</w:t>
-      </w:r>
-      <w:r>
-        <w:rPr/>
-        <w:t xml:space="preserve"> gra</w:t>
-      </w:r>
-      <w:r>
-        <w:rPr/>
-        <w:t xml:space="preserve"> to </w:t>
-      </w:r>
-      <w:r>
-        <w:rPr/>
-        <w:t>b</w:t>
-      </w:r>
-      <w:r>
-        <w:rPr/>
-        <w:t>ę</w:t>
-      </w:r>
-      <w:r>
-        <w:rPr/>
-        <w:t>dzie</w:t>
-      </w:r>
-      <w:r>
-        <w:rPr/>
-        <w:t xml:space="preserve"> </w:t>
-      </w:r>
-      <w:r>
-        <w:rPr/>
-        <w:t xml:space="preserve">“Salon </w:t>
-      </w:r>
-      <w:r>
-        <w:rPr/>
-        <w:t>Gier”-</w:t>
-      </w:r>
-      <w:r>
-        <w:rPr/>
-        <w:t xml:space="preserve"> kilka prostych, klasycznych gier.</w:t>
-      </w:r>
-    </w:p>
-    <w:p>
-      <w:r>
-        <w:rPr/>
-        <w:t>Przede wszystkim z:</w:t>
-      </w:r>
-    </w:p>
-    <w:p>
-      <w:r>
-        <w:rPr/>
-        <w:t>1. Kółko i krzyżyk</w:t>
-      </w:r>
-    </w:p>
-    <w:p>
-      <w:r>
-        <w:rPr/>
-        <w:t>2. Blackjack</w:t>
-      </w:r>
-    </w:p>
-    <w:p>
-      <w:r>
-        <w:rPr/>
-        <w:t xml:space="preserve">30 maja – Start pracy nad menu głównym projektu. </w:t>
-      </w:r>
-    </w:p>
-    <w:p>
-      <w:pPr>
-        <w:pStyle w:val="ListParagraph"/>
+        <w:t xml:space="preserve">Nauka funkcji z switch z filmiku: </w:t>
+      </w:r>
+      <w:hyperlink r:id="R61f60b439ef64d65">
+        <w:r>
+          <w:rPr>
+            <w:rStyle w:val="Hipercze"/>
+          </w:rPr>
+          <w:t>https://www.youtube.com/watch?v=ib7LXBNfZ7g</w:t>
+        </w:r>
+      </w:hyperlink>
+    </w:p>
+    <w:p>
+      <w:pPr>
+        <w:pStyle w:val="Akapitzlist"/>
         <w:numPr>
           <w:ilvl w:val="0"/>
           <w:numId w:val="2"/>
@@ -84,81 +85,390 @@
       </w:pPr>
       <w:r>
         <w:rPr/>
-        <w:t xml:space="preserve">Nauka funkcji z </w:t>
-      </w:r>
+        <w:t>Ukończenie podstawowego menu głównego projektu</w:t>
+      </w:r>
+    </w:p>
+    <w:p>
+      <w:pPr>
+        <w:pStyle w:val="Normalny"/>
+        <w:ind w:left="0"/>
+      </w:pPr>
       <w:r>
         <w:rPr/>
-        <w:t>switch</w:t>
+        <w:t>31 maja</w:t>
       </w:r>
       <w:r>
         <w:rPr/>
-        <w:t xml:space="preserve"> z filmiku: </w:t>
-      </w:r>
-      <w:hyperlink r:id="R65ec3aeaa98e46c6">
+        <w:t xml:space="preserve"> – Dopracowanie menu, start pracy nad kółkiem i krzyżyk</w:t>
+      </w:r>
+    </w:p>
+    <w:p>
+      <w:pPr>
+        <w:pStyle w:val="Akapitzlist"/>
+        <w:ind w:left="720"/>
+        <w:rPr>
+          <w:sz w:val="22"/>
+          <w:szCs w:val="22"/>
+        </w:rPr>
+      </w:pPr>
+      <w:r>
+        <w:rPr>
+          <w:sz w:val="22"/>
+          <w:szCs w:val="22"/>
+        </w:rPr>
+        <w:t>Nauk</w:t>
+      </w:r>
+      <w:r>
+        <w:rPr>
+          <w:sz w:val="22"/>
+          <w:szCs w:val="22"/>
+        </w:rPr>
+        <w:t>a</w:t>
+      </w:r>
+      <w:r>
+        <w:rPr>
+          <w:sz w:val="22"/>
+          <w:szCs w:val="22"/>
+        </w:rPr>
+        <w:t>:</w:t>
+      </w:r>
+    </w:p>
+    <w:p>
+      <w:pPr>
+        <w:pStyle w:val="Akapitzlist"/>
+        <w:ind w:left="720"/>
+        <w:rPr>
+          <w:rStyle w:val="Hipercze"/>
+          <w:sz w:val="22"/>
+          <w:szCs w:val="22"/>
+          <w:lang w:val="en-US"/>
+        </w:rPr>
+      </w:pPr>
+      <w:r>
+        <w:rPr>
+          <w:sz w:val="22"/>
+          <w:szCs w:val="22"/>
+          <w:lang w:val="en-US"/>
+        </w:rPr>
+        <w:t>-</w:t>
+      </w:r>
+      <w:r>
+        <w:rPr>
+          <w:sz w:val="22"/>
+          <w:szCs w:val="22"/>
+          <w:lang w:val="en-US"/>
+        </w:rPr>
+        <w:t xml:space="preserve"> </w:t>
+      </w:r>
+      <w:r>
+        <w:rPr>
+          <w:sz w:val="22"/>
+          <w:szCs w:val="22"/>
+          <w:lang w:val="en-US"/>
+        </w:rPr>
+        <w:t>funkcji</w:t>
+      </w:r>
+      <w:r>
+        <w:rPr>
+          <w:sz w:val="22"/>
+          <w:szCs w:val="22"/>
+          <w:lang w:val="en-US"/>
+        </w:rPr>
+        <w:t xml:space="preserve"> void:</w:t>
+      </w:r>
+      <w:r>
+        <w:rPr>
+          <w:sz w:val="22"/>
+          <w:szCs w:val="22"/>
+          <w:lang w:val="en-US"/>
+        </w:rPr>
+        <w:t xml:space="preserve"> </w:t>
+      </w:r>
+      <w:hyperlink r:id="R983e7f7f87a44cb1">
         <w:r>
           <w:rPr>
-            <w:rStyle w:val="Hyperlink"/>
+            <w:rStyle w:val="Hipercze"/>
+            <w:sz w:val="22"/>
+            <w:szCs w:val="22"/>
+            <w:lang w:val="en-US"/>
           </w:rPr>
-          <w:t>https://www.youtube.com/watch?v=ib7LXBNfZ7g</w:t>
+          <w:t>https://www.youtube.com/watch?v=8gwPPQf_h2g</w:t>
         </w:r>
       </w:hyperlink>
     </w:p>
     <w:p>
       <w:pPr>
-        <w:pStyle w:val="ListParagraph"/>
+        <w:pStyle w:val="Akapitzlist"/>
+        <w:ind w:left="720"/>
+        <w:rPr>
+          <w:sz w:val="22"/>
+          <w:szCs w:val="22"/>
+        </w:rPr>
+      </w:pPr>
+      <w:r>
+        <w:rPr>
+          <w:sz w:val="22"/>
+          <w:szCs w:val="22"/>
+          <w:lang w:val="pt-BR"/>
+        </w:rPr>
+        <w:t>- tablic dwuwymiarowych</w:t>
+      </w:r>
+      <w:r>
+        <w:rPr>
+          <w:sz w:val="22"/>
+          <w:szCs w:val="22"/>
+          <w:lang w:val="pt-BR"/>
+        </w:rPr>
+        <w:t xml:space="preserve"> </w:t>
+      </w:r>
+      <w:hyperlink r:id="Rf0149803b8dd403f">
+        <w:r>
+          <w:rPr>
+            <w:rStyle w:val="Hipercze"/>
+            <w:sz w:val="22"/>
+            <w:szCs w:val="22"/>
+            <w:lang w:val="pt-BR"/>
+          </w:rPr>
+          <w:t>https://www.youtube.com/watch?v=cfovDcIa090</w:t>
+        </w:r>
+      </w:hyperlink>
+      <w:r>
+        <w:rPr>
+          <w:sz w:val="22"/>
+          <w:szCs w:val="22"/>
+          <w:lang w:val="pt-BR"/>
+        </w:rPr>
+        <w:t xml:space="preserve">, </w:t>
+      </w:r>
+      <w:hyperlink r:id="Rfae29a4e363c41a3">
+        <w:r>
+          <w:rPr>
+            <w:rStyle w:val="Hipercze"/>
+            <w:sz w:val="22"/>
+            <w:szCs w:val="22"/>
+            <w:lang w:val="pt-BR"/>
+          </w:rPr>
+          <w:t>https://www.youtube.com/watch?v=6t82pRaWGQI</w:t>
+        </w:r>
+      </w:hyperlink>
+    </w:p>
+    <w:p>
+      <w:pPr>
+        <w:pStyle w:val="Akapitzlist"/>
+        <w:ind w:left="720"/>
+        <w:rPr>
+          <w:sz w:val="22"/>
+          <w:szCs w:val="22"/>
+        </w:rPr>
+      </w:pPr>
+      <w:r>
+        <w:rPr>
+          <w:sz w:val="22"/>
+          <w:szCs w:val="22"/>
+        </w:rPr>
+        <w:t>- użycie AI do przykładowego wyglądu planszy kółko i krzyżyk</w:t>
+      </w:r>
+    </w:p>
+    <w:p>
+      <w:pPr>
+        <w:pStyle w:val="Akapitzlist"/>
+        <w:ind w:left="720"/>
+        <w:rPr>
+          <w:sz w:val="22"/>
+          <w:szCs w:val="22"/>
+        </w:rPr>
+      </w:pPr>
+      <w:r>
+        <w:rPr>
+          <w:sz w:val="22"/>
+          <w:szCs w:val="22"/>
+        </w:rPr>
+        <w:t xml:space="preserve">(Odpowiedź - </w:t>
+      </w:r>
+    </w:p>
+    <w:p>
+      <w:pPr>
+        <w:pStyle w:val="Akapitzlist"/>
+        <w:ind w:left="720"/>
+        <w:rPr>
+          <w:sz w:val="22"/>
+          <w:szCs w:val="22"/>
+        </w:rPr>
+      </w:pPr>
+      <w:r>
+        <w:rPr>
+          <w:sz w:val="22"/>
+          <w:szCs w:val="22"/>
+        </w:rPr>
+        <w:t xml:space="preserve">      1   2   3</w:t>
+      </w:r>
+    </w:p>
+    <w:p>
+      <w:pPr>
+        <w:pStyle w:val="Akapitzlist"/>
+        <w:ind w:left="720"/>
+      </w:pPr>
+      <w:r>
+        <w:rPr>
+          <w:sz w:val="22"/>
+          <w:szCs w:val="22"/>
+        </w:rPr>
+        <w:t xml:space="preserve">    +---+---+---+</w:t>
+      </w:r>
+    </w:p>
+    <w:p>
+      <w:pPr>
+        <w:pStyle w:val="Akapitzlist"/>
+        <w:ind w:left="720"/>
+      </w:pPr>
+      <w:r>
+        <w:rPr>
+          <w:sz w:val="22"/>
+          <w:szCs w:val="22"/>
+        </w:rPr>
+        <w:t xml:space="preserve">  1 | - | - | - |</w:t>
+      </w:r>
+    </w:p>
+    <w:p>
+      <w:pPr>
+        <w:pStyle w:val="Akapitzlist"/>
+        <w:ind w:left="720"/>
+      </w:pPr>
+      <w:r>
+        <w:rPr>
+          <w:sz w:val="22"/>
+          <w:szCs w:val="22"/>
+        </w:rPr>
+        <w:t xml:space="preserve">    +---+---+---+</w:t>
+      </w:r>
+    </w:p>
+    <w:p>
+      <w:pPr>
+        <w:pStyle w:val="Akapitzlist"/>
+        <w:ind w:left="720"/>
+      </w:pPr>
+      <w:r>
+        <w:rPr>
+          <w:sz w:val="22"/>
+          <w:szCs w:val="22"/>
+        </w:rPr>
+        <w:t xml:space="preserve">  2 | - | - | - |</w:t>
+      </w:r>
+    </w:p>
+    <w:p>
+      <w:pPr>
+        <w:pStyle w:val="Akapitzlist"/>
+        <w:ind w:left="720"/>
+      </w:pPr>
+      <w:r>
+        <w:rPr>
+          <w:sz w:val="22"/>
+          <w:szCs w:val="22"/>
+        </w:rPr>
+        <w:t xml:space="preserve">    +---+---+---+</w:t>
+      </w:r>
+    </w:p>
+    <w:p>
+      <w:pPr>
+        <w:pStyle w:val="Akapitzlist"/>
+        <w:ind w:left="720"/>
+      </w:pPr>
+      <w:r>
+        <w:rPr>
+          <w:sz w:val="22"/>
+          <w:szCs w:val="22"/>
+        </w:rPr>
+        <w:t xml:space="preserve">  3 | - | - | - |</w:t>
+      </w:r>
+    </w:p>
+    <w:p>
+      <w:pPr>
+        <w:pStyle w:val="Akapitzlist"/>
+        <w:ind w:left="720"/>
+      </w:pPr>
+      <w:r>
+        <w:rPr>
+          <w:sz w:val="22"/>
+          <w:szCs w:val="22"/>
+        </w:rPr>
+        <w:t xml:space="preserve">    +---+---+---+ )</w:t>
+      </w:r>
+    </w:p>
+    <w:p>
+      <w:pPr>
+        <w:pStyle w:val="Akapitzlist"/>
         <w:numPr>
           <w:ilvl w:val="0"/>
-          <w:numId w:val="2"/>
+          <w:numId w:val="6"/>
         </w:numPr>
-        <w:rPr/>
-      </w:pPr>
-    </w:p>
-    <w:p>
-      <w:pPr>
-        <w:pStyle w:val="ListParagraph"/>
+        <w:rPr>
+          <w:sz w:val="22"/>
+          <w:szCs w:val="22"/>
+        </w:rPr>
+      </w:pPr>
+      <w:r>
+        <w:rPr>
+          <w:sz w:val="22"/>
+          <w:szCs w:val="22"/>
+        </w:rPr>
+        <w:t>Ukończenie funkcji wypisania tablicy kółko i krzyżyk</w:t>
+      </w:r>
+    </w:p>
+    <w:p>
+      <w:pPr>
+        <w:pStyle w:val="Akapitzlist"/>
         <w:ind w:left="720"/>
-      </w:pPr>
-    </w:p>
-    <w:p>
-      <w:pPr>
-        <w:pStyle w:val="Normalny"/>
+        <w:rPr>
+          <w:sz w:val="22"/>
+          <w:szCs w:val="22"/>
+        </w:rPr>
+      </w:pPr>
+    </w:p>
+    <w:p>
+      <w:pPr>
+        <w:pStyle w:val="Akapitzlist"/>
         <w:ind w:left="720"/>
-      </w:pPr>
-    </w:p>
-    <w:p>
-      <w:pPr>
-        <w:pStyle w:val="Normalny"/>
+        <w:rPr>
+          <w:sz w:val="22"/>
+          <w:szCs w:val="22"/>
+        </w:rPr>
+      </w:pPr>
+    </w:p>
+    <w:p>
+      <w:pPr>
+        <w:pStyle w:val="Akapitzlist"/>
+        <w:ind w:left="720"/>
+        <w:rPr>
+          <w:sz w:val="22"/>
+          <w:szCs w:val="22"/>
+        </w:rPr>
+      </w:pPr>
+    </w:p>
+    <w:p>
+      <w:pPr>
+        <w:ind w:left="720"/>
+      </w:pPr>
+    </w:p>
+    <w:p>
+      <w:pPr>
         <w:ind w:left="708"/>
       </w:pPr>
     </w:p>
-    <w:p>
-      <w:pPr>
-        <w:pStyle w:val="Normalny"/>
-        <w:ind w:left="0"/>
-      </w:pPr>
-    </w:p>
-    <w:p>
-      <w:pPr>
-        <w:pStyle w:val="Normalny"/>
-        <w:ind w:left="0"/>
-      </w:pPr>
-    </w:p>
-    <w:p>
-      <w:pPr>
-        <w:pStyle w:val="Normalny"/>
+    <w:p/>
+    <w:p/>
+    <w:p>
+      <w:pPr>
         <w:ind w:left="708"/>
       </w:pPr>
     </w:p>
     <w:p>
       <w:pPr>
-        <w:pStyle w:val="Normalny"/>
         <w:ind w:left="708"/>
       </w:pPr>
     </w:p>
     <w:p>
       <w:pPr>
-        <w:pStyle w:val="ListParagraph"/>
-        <w:ind w:left="720"/>
+        <w:pStyle w:val="Akapitzlist"/>
       </w:pPr>
     </w:p>
     <w:sectPr>
@@ -172,9 +482,9 @@
 </file>
 
 <file path=word/numbering.xml><?xml version="1.0" encoding="utf-8"?>
-<w:numbering xmlns:w="http://schemas.openxmlformats.org/wordprocessingml/2006/main">
-  <w:abstractNum xmlns:w="http://schemas.openxmlformats.org/wordprocessingml/2006/main" w:abstractNumId="3">
-    <w:nsid w:val="2bceb1bb"/>
+<w:numbering xmlns:wpc="http://schemas.microsoft.com/office/word/2010/wordprocessingCanvas" xmlns:cx="http://schemas.microsoft.com/office/drawing/2014/chartex" xmlns:cx1="http://schemas.microsoft.com/office/drawing/2015/9/8/chartex" xmlns:cx2="http://schemas.microsoft.com/office/drawing/2015/10/21/chartex" xmlns:cx3="http://schemas.microsoft.com/office/drawing/2016/5/9/chartex" xmlns:cx4="http://schemas.microsoft.com/office/drawing/2016/5/10/chartex" xmlns:cx5="http://schemas.microsoft.com/office/drawing/2016/5/11/chartex" xmlns:cx6="http://schemas.microsoft.com/office/drawing/2016/5/12/chartex" xmlns:cx7="http://schemas.microsoft.com/office/drawing/2016/5/13/chartex" xmlns:cx8="http://schemas.microsoft.com/office/drawing/2016/5/14/chartex" xmlns:mc="http://schemas.openxmlformats.org/markup-compatibility/2006" xmlns:aink="http://schemas.microsoft.com/office/drawing/2016/ink" xmlns:am3d="http://schemas.microsoft.com/office/drawing/2017/model3d" xmlns:o="urn:schemas-microsoft-com:office:office" xmlns:oel="http://schemas.microsoft.com/office/2019/extlst" xmlns:r="http://schemas.openxmlformats.org/officeDocument/2006/relationships" xmlns:m="http://schemas.openxmlformats.org/officeDocument/2006/math" xmlns:v="urn:schemas-microsoft-com:vml" xmlns:wp14="http://schemas.microsoft.com/office/word/2010/wordprocessingDrawing" xmlns:wp="http://schemas.openxmlformats.org/drawingml/2006/wordprocessingDrawing" xmlns:w10="urn:schemas-microsoft-com:office:word" xmlns:w="http://schemas.openxmlformats.org/wordprocessingml/2006/main" xmlns:w14="http://schemas.microsoft.com/office/word/2010/wordml" xmlns:w15="http://schemas.microsoft.com/office/word/2012/wordml" xmlns:w16cex="http://schemas.microsoft.com/office/word/2018/wordml/cex" xmlns:w16cid="http://schemas.microsoft.com/office/word/2016/wordml/cid" xmlns:w16="http://schemas.microsoft.com/office/word/2018/wordml" xmlns:w16du="http://schemas.microsoft.com/office/word/2023/wordml/word16du" xmlns:w16sdtdh="http://schemas.microsoft.com/office/word/2020/wordml/sdtdatahash" xmlns:w16sdtfl="http://schemas.microsoft.com/office/word/2024/wordml/sdtformatlock" xmlns:w16se="http://schemas.microsoft.com/office/word/2015/wordml/symex" xmlns:wpg="http://schemas.microsoft.com/office/word/2010/wordprocessingGroup" xmlns:wpi="http://schemas.microsoft.com/office/word/2010/wordprocessingInk" xmlns:wne="http://schemas.microsoft.com/office/word/2006/wordml" xmlns:wps="http://schemas.microsoft.com/office/word/2010/wordprocessingShape" mc:Ignorable="w14 w15 w16se w16cid w16 w16cex w16sdtdh w16sdtfl w16du wp14">
+  <w:abstractNum xmlns:w="http://schemas.openxmlformats.org/wordprocessingml/2006/main" w:abstractNumId="5">
+    <w:nsid w:val="4e46470"/>
     <w:multiLevelType xmlns:w="http://schemas.openxmlformats.org/wordprocessingml/2006/main" w:val="hybridMultilevel"/>
     <w:lvl xmlns:w="http://schemas.openxmlformats.org/wordprocessingml/2006/main" w:ilvl="0">
       <w:start w:val="1"/>
@@ -285,8 +595,8 @@
       </w:rPr>
     </w:lvl>
   </w:abstractNum>
-  <w:abstractNum xmlns:w="http://schemas.openxmlformats.org/wordprocessingml/2006/main" w:abstractNumId="2">
-    <w:nsid w:val="75e15581"/>
+  <w:abstractNum xmlns:w="http://schemas.openxmlformats.org/wordprocessingml/2006/main" w:abstractNumId="4">
+    <w:nsid w:val="4bf8614f"/>
     <w:multiLevelType xmlns:w="http://schemas.openxmlformats.org/wordprocessingml/2006/main" w:val="hybridMultilevel"/>
     <w:lvl xmlns:w="http://schemas.openxmlformats.org/wordprocessingml/2006/main" w:ilvl="0">
       <w:start w:val="1"/>
@@ -294,7 +604,7 @@
       <w:lvlText w:val="-"/>
       <w:lvlJc w:val="left"/>
       <w:pPr>
-        <w:ind w:left="720" w:hanging="360"/>
+        <w:ind w:left="1080" w:hanging="360"/>
       </w:pPr>
       <w:rPr>
         <w:rFonts w:hint="default" w:ascii="Aptos" w:hAnsi="Aptos"/>
@@ -306,7 +616,7 @@
       <w:lvlText w:val="o"/>
       <w:lvlJc w:val="left"/>
       <w:pPr>
-        <w:ind w:left="1440" w:hanging="360"/>
+        <w:ind w:left="1800" w:hanging="360"/>
       </w:pPr>
       <w:rPr>
         <w:rFonts w:hint="default" w:ascii="Courier New" w:hAnsi="Courier New"/>
@@ -318,7 +628,7 @@
       <w:lvlText w:val=""/>
       <w:lvlJc w:val="left"/>
       <w:pPr>
-        <w:ind w:left="2160" w:hanging="360"/>
+        <w:ind w:left="2520" w:hanging="360"/>
       </w:pPr>
       <w:rPr>
         <w:rFonts w:hint="default" w:ascii="Wingdings" w:hAnsi="Wingdings"/>
@@ -330,7 +640,7 @@
       <w:lvlText w:val=""/>
       <w:lvlJc w:val="left"/>
       <w:pPr>
-        <w:ind w:left="2880" w:hanging="360"/>
+        <w:ind w:left="3240" w:hanging="360"/>
       </w:pPr>
       <w:rPr>
         <w:rFonts w:hint="default" w:ascii="Symbol" w:hAnsi="Symbol"/>
@@ -342,7 +652,7 @@
       <w:lvlText w:val="o"/>
       <w:lvlJc w:val="left"/>
       <w:pPr>
-        <w:ind w:left="3600" w:hanging="360"/>
+        <w:ind w:left="3960" w:hanging="360"/>
       </w:pPr>
       <w:rPr>
         <w:rFonts w:hint="default" w:ascii="Courier New" w:hAnsi="Courier New"/>
@@ -354,7 +664,7 @@
       <w:lvlText w:val=""/>
       <w:lvlJc w:val="left"/>
       <w:pPr>
-        <w:ind w:left="4320" w:hanging="360"/>
+        <w:ind w:left="4680" w:hanging="360"/>
       </w:pPr>
       <w:rPr>
         <w:rFonts w:hint="default" w:ascii="Wingdings" w:hAnsi="Wingdings"/>
@@ -366,7 +676,7 @@
       <w:lvlText w:val=""/>
       <w:lvlJc w:val="left"/>
       <w:pPr>
-        <w:ind w:left="5040" w:hanging="360"/>
+        <w:ind w:left="5400" w:hanging="360"/>
       </w:pPr>
       <w:rPr>
         <w:rFonts w:hint="default" w:ascii="Symbol" w:hAnsi="Symbol"/>
@@ -378,7 +688,7 @@
       <w:lvlText w:val="o"/>
       <w:lvlJc w:val="left"/>
       <w:pPr>
-        <w:ind w:left="5760" w:hanging="360"/>
+        <w:ind w:left="6120" w:hanging="360"/>
       </w:pPr>
       <w:rPr>
         <w:rFonts w:hint="default" w:ascii="Courier New" w:hAnsi="Courier New"/>
@@ -390,18 +700,244 @@
       <w:lvlText w:val=""/>
       <w:lvlJc w:val="left"/>
       <w:pPr>
-        <w:ind w:left="6480" w:hanging="360"/>
+        <w:ind w:left="6840" w:hanging="360"/>
       </w:pPr>
       <w:rPr>
         <w:rFonts w:hint="default" w:ascii="Wingdings" w:hAnsi="Wingdings"/>
       </w:rPr>
     </w:lvl>
   </w:abstractNum>
-  <w:abstractNum xmlns:w="http://schemas.openxmlformats.org/wordprocessingml/2006/main" w:abstractNumId="1">
-    <w:nsid w:val="4e21ea2a"/>
+  <w:abstractNum xmlns:w="http://schemas.openxmlformats.org/wordprocessingml/2006/main" w:abstractNumId="3">
+    <w:nsid w:val="4f0ef9be"/>
     <w:multiLevelType xmlns:w="http://schemas.openxmlformats.org/wordprocessingml/2006/main" w:val="hybridMultilevel"/>
     <w:lvl xmlns:w="http://schemas.openxmlformats.org/wordprocessingml/2006/main" w:ilvl="0">
       <w:start w:val="1"/>
+      <w:numFmt w:val="bullet"/>
+      <w:lvlText w:val="-"/>
+      <w:lvlJc w:val="left"/>
+      <w:pPr>
+        <w:ind w:left="720" w:hanging="360"/>
+      </w:pPr>
+      <w:rPr>
+        <w:rFonts w:hint="default" w:ascii="Aptos" w:hAnsi="Aptos"/>
+      </w:rPr>
+    </w:lvl>
+    <w:lvl xmlns:w="http://schemas.openxmlformats.org/wordprocessingml/2006/main" w:ilvl="1">
+      <w:start w:val="1"/>
+      <w:numFmt w:val="bullet"/>
+      <w:lvlText w:val="o"/>
+      <w:lvlJc w:val="left"/>
+      <w:pPr>
+        <w:ind w:left="1440" w:hanging="360"/>
+      </w:pPr>
+      <w:rPr>
+        <w:rFonts w:hint="default" w:ascii="Courier New" w:hAnsi="Courier New"/>
+      </w:rPr>
+    </w:lvl>
+    <w:lvl xmlns:w="http://schemas.openxmlformats.org/wordprocessingml/2006/main" w:ilvl="2">
+      <w:start w:val="1"/>
+      <w:numFmt w:val="bullet"/>
+      <w:lvlText w:val=""/>
+      <w:lvlJc w:val="left"/>
+      <w:pPr>
+        <w:ind w:left="2160" w:hanging="360"/>
+      </w:pPr>
+      <w:rPr>
+        <w:rFonts w:hint="default" w:ascii="Wingdings" w:hAnsi="Wingdings"/>
+      </w:rPr>
+    </w:lvl>
+    <w:lvl xmlns:w="http://schemas.openxmlformats.org/wordprocessingml/2006/main" w:ilvl="3">
+      <w:start w:val="1"/>
+      <w:numFmt w:val="bullet"/>
+      <w:lvlText w:val=""/>
+      <w:lvlJc w:val="left"/>
+      <w:pPr>
+        <w:ind w:left="2880" w:hanging="360"/>
+      </w:pPr>
+      <w:rPr>
+        <w:rFonts w:hint="default" w:ascii="Symbol" w:hAnsi="Symbol"/>
+      </w:rPr>
+    </w:lvl>
+    <w:lvl xmlns:w="http://schemas.openxmlformats.org/wordprocessingml/2006/main" w:ilvl="4">
+      <w:start w:val="1"/>
+      <w:numFmt w:val="bullet"/>
+      <w:lvlText w:val="o"/>
+      <w:lvlJc w:val="left"/>
+      <w:pPr>
+        <w:ind w:left="3600" w:hanging="360"/>
+      </w:pPr>
+      <w:rPr>
+        <w:rFonts w:hint="default" w:ascii="Courier New" w:hAnsi="Courier New"/>
+      </w:rPr>
+    </w:lvl>
+    <w:lvl xmlns:w="http://schemas.openxmlformats.org/wordprocessingml/2006/main" w:ilvl="5">
+      <w:start w:val="1"/>
+      <w:numFmt w:val="bullet"/>
+      <w:lvlText w:val=""/>
+      <w:lvlJc w:val="left"/>
+      <w:pPr>
+        <w:ind w:left="4320" w:hanging="360"/>
+      </w:pPr>
+      <w:rPr>
+        <w:rFonts w:hint="default" w:ascii="Wingdings" w:hAnsi="Wingdings"/>
+      </w:rPr>
+    </w:lvl>
+    <w:lvl xmlns:w="http://schemas.openxmlformats.org/wordprocessingml/2006/main" w:ilvl="6">
+      <w:start w:val="1"/>
+      <w:numFmt w:val="bullet"/>
+      <w:lvlText w:val=""/>
+      <w:lvlJc w:val="left"/>
+      <w:pPr>
+        <w:ind w:left="5040" w:hanging="360"/>
+      </w:pPr>
+      <w:rPr>
+        <w:rFonts w:hint="default" w:ascii="Symbol" w:hAnsi="Symbol"/>
+      </w:rPr>
+    </w:lvl>
+    <w:lvl xmlns:w="http://schemas.openxmlformats.org/wordprocessingml/2006/main" w:ilvl="7">
+      <w:start w:val="1"/>
+      <w:numFmt w:val="bullet"/>
+      <w:lvlText w:val="o"/>
+      <w:lvlJc w:val="left"/>
+      <w:pPr>
+        <w:ind w:left="5760" w:hanging="360"/>
+      </w:pPr>
+      <w:rPr>
+        <w:rFonts w:hint="default" w:ascii="Courier New" w:hAnsi="Courier New"/>
+      </w:rPr>
+    </w:lvl>
+    <w:lvl xmlns:w="http://schemas.openxmlformats.org/wordprocessingml/2006/main" w:ilvl="8">
+      <w:start w:val="1"/>
+      <w:numFmt w:val="bullet"/>
+      <w:lvlText w:val=""/>
+      <w:lvlJc w:val="left"/>
+      <w:pPr>
+        <w:ind w:left="6480" w:hanging="360"/>
+      </w:pPr>
+      <w:rPr>
+        <w:rFonts w:hint="default" w:ascii="Wingdings" w:hAnsi="Wingdings"/>
+      </w:rPr>
+    </w:lvl>
+  </w:abstractNum>
+  <w:abstractNum w:abstractNumId="0" w15:restartNumberingAfterBreak="0">
+    <w:nsid w:val="2BCEB1BB"/>
+    <w:multiLevelType w:val="hybridMultilevel"/>
+    <w:tmpl w:val="FFFFFFFF"/>
+    <w:lvl w:ilvl="0" w:tplc="34A61C48">
+      <w:start w:val="1"/>
+      <w:numFmt w:val="bullet"/>
+      <w:lvlText w:val="-"/>
+      <w:lvlJc w:val="left"/>
+      <w:pPr>
+        <w:ind w:left="1080" w:hanging="360"/>
+      </w:pPr>
+      <w:rPr>
+        <w:rFonts w:hint="default" w:ascii="Aptos" w:hAnsi="Aptos"/>
+      </w:rPr>
+    </w:lvl>
+    <w:lvl w:ilvl="1" w:tplc="7C9E16F6">
+      <w:start w:val="1"/>
+      <w:numFmt w:val="bullet"/>
+      <w:lvlText w:val="o"/>
+      <w:lvlJc w:val="left"/>
+      <w:pPr>
+        <w:ind w:left="1800" w:hanging="360"/>
+      </w:pPr>
+      <w:rPr>
+        <w:rFonts w:hint="default" w:ascii="Courier New" w:hAnsi="Courier New"/>
+      </w:rPr>
+    </w:lvl>
+    <w:lvl w:ilvl="2" w:tplc="558AE812">
+      <w:start w:val="1"/>
+      <w:numFmt w:val="bullet"/>
+      <w:lvlText w:val=""/>
+      <w:lvlJc w:val="left"/>
+      <w:pPr>
+        <w:ind w:left="2520" w:hanging="360"/>
+      </w:pPr>
+      <w:rPr>
+        <w:rFonts w:hint="default" w:ascii="Wingdings" w:hAnsi="Wingdings"/>
+      </w:rPr>
+    </w:lvl>
+    <w:lvl w:ilvl="3" w:tplc="B5809B6E">
+      <w:start w:val="1"/>
+      <w:numFmt w:val="bullet"/>
+      <w:lvlText w:val=""/>
+      <w:lvlJc w:val="left"/>
+      <w:pPr>
+        <w:ind w:left="3240" w:hanging="360"/>
+      </w:pPr>
+      <w:rPr>
+        <w:rFonts w:hint="default" w:ascii="Symbol" w:hAnsi="Symbol"/>
+      </w:rPr>
+    </w:lvl>
+    <w:lvl w:ilvl="4" w:tplc="48E25222">
+      <w:start w:val="1"/>
+      <w:numFmt w:val="bullet"/>
+      <w:lvlText w:val="o"/>
+      <w:lvlJc w:val="left"/>
+      <w:pPr>
+        <w:ind w:left="3960" w:hanging="360"/>
+      </w:pPr>
+      <w:rPr>
+        <w:rFonts w:hint="default" w:ascii="Courier New" w:hAnsi="Courier New"/>
+      </w:rPr>
+    </w:lvl>
+    <w:lvl w:ilvl="5" w:tplc="38A44990">
+      <w:start w:val="1"/>
+      <w:numFmt w:val="bullet"/>
+      <w:lvlText w:val=""/>
+      <w:lvlJc w:val="left"/>
+      <w:pPr>
+        <w:ind w:left="4680" w:hanging="360"/>
+      </w:pPr>
+      <w:rPr>
+        <w:rFonts w:hint="default" w:ascii="Wingdings" w:hAnsi="Wingdings"/>
+      </w:rPr>
+    </w:lvl>
+    <w:lvl w:ilvl="6" w:tplc="882C9FF2">
+      <w:start w:val="1"/>
+      <w:numFmt w:val="bullet"/>
+      <w:lvlText w:val=""/>
+      <w:lvlJc w:val="left"/>
+      <w:pPr>
+        <w:ind w:left="5400" w:hanging="360"/>
+      </w:pPr>
+      <w:rPr>
+        <w:rFonts w:hint="default" w:ascii="Symbol" w:hAnsi="Symbol"/>
+      </w:rPr>
+    </w:lvl>
+    <w:lvl w:ilvl="7" w:tplc="7696E188">
+      <w:start w:val="1"/>
+      <w:numFmt w:val="bullet"/>
+      <w:lvlText w:val="o"/>
+      <w:lvlJc w:val="left"/>
+      <w:pPr>
+        <w:ind w:left="6120" w:hanging="360"/>
+      </w:pPr>
+      <w:rPr>
+        <w:rFonts w:hint="default" w:ascii="Courier New" w:hAnsi="Courier New"/>
+      </w:rPr>
+    </w:lvl>
+    <w:lvl w:ilvl="8" w:tplc="C88A05EE">
+      <w:start w:val="1"/>
+      <w:numFmt w:val="bullet"/>
+      <w:lvlText w:val=""/>
+      <w:lvlJc w:val="left"/>
+      <w:pPr>
+        <w:ind w:left="6840" w:hanging="360"/>
+      </w:pPr>
+      <w:rPr>
+        <w:rFonts w:hint="default" w:ascii="Wingdings" w:hAnsi="Wingdings"/>
+      </w:rPr>
+    </w:lvl>
+  </w:abstractNum>
+  <w:abstractNum w:abstractNumId="1" w15:restartNumberingAfterBreak="0">
+    <w:nsid w:val="4E21EA2A"/>
+    <w:multiLevelType w:val="hybridMultilevel"/>
+    <w:tmpl w:val="FFFFFFFF"/>
+    <w:lvl w:ilvl="0" w:tplc="F208BAE6">
+      <w:start w:val="1"/>
       <w:numFmt w:val="decimal"/>
       <w:lvlText w:val="%1."/>
       <w:lvlJc w:val="left"/>
@@ -409,7 +945,7 @@
         <w:ind w:left="720" w:hanging="360"/>
       </w:pPr>
     </w:lvl>
-    <w:lvl xmlns:w="http://schemas.openxmlformats.org/wordprocessingml/2006/main" w:ilvl="1">
+    <w:lvl w:ilvl="1" w:tplc="8EF862F8">
       <w:start w:val="1"/>
       <w:numFmt w:val="lowerLetter"/>
       <w:lvlText w:val="%2."/>
@@ -418,7 +954,7 @@
         <w:ind w:left="1440" w:hanging="360"/>
       </w:pPr>
     </w:lvl>
-    <w:lvl xmlns:w="http://schemas.openxmlformats.org/wordprocessingml/2006/main" w:ilvl="2">
+    <w:lvl w:ilvl="2" w:tplc="3C48035E">
       <w:start w:val="1"/>
       <w:numFmt w:val="lowerRoman"/>
       <w:lvlText w:val="%3."/>
@@ -427,7 +963,7 @@
         <w:ind w:left="2160" w:hanging="180"/>
       </w:pPr>
     </w:lvl>
-    <w:lvl xmlns:w="http://schemas.openxmlformats.org/wordprocessingml/2006/main" w:ilvl="3">
+    <w:lvl w:ilvl="3" w:tplc="AA7E3706">
       <w:start w:val="1"/>
       <w:numFmt w:val="decimal"/>
       <w:lvlText w:val="%4."/>
@@ -436,7 +972,7 @@
         <w:ind w:left="2880" w:hanging="360"/>
       </w:pPr>
     </w:lvl>
-    <w:lvl xmlns:w="http://schemas.openxmlformats.org/wordprocessingml/2006/main" w:ilvl="4">
+    <w:lvl w:ilvl="4" w:tplc="4A62F87C">
       <w:start w:val="1"/>
       <w:numFmt w:val="lowerLetter"/>
       <w:lvlText w:val="%5."/>
@@ -445,7 +981,7 @@
         <w:ind w:left="3600" w:hanging="360"/>
       </w:pPr>
     </w:lvl>
-    <w:lvl xmlns:w="http://schemas.openxmlformats.org/wordprocessingml/2006/main" w:ilvl="5">
+    <w:lvl w:ilvl="5" w:tplc="621E803C">
       <w:start w:val="1"/>
       <w:numFmt w:val="lowerRoman"/>
       <w:lvlText w:val="%6."/>
@@ -454,7 +990,7 @@
         <w:ind w:left="4320" w:hanging="180"/>
       </w:pPr>
     </w:lvl>
-    <w:lvl xmlns:w="http://schemas.openxmlformats.org/wordprocessingml/2006/main" w:ilvl="6">
+    <w:lvl w:ilvl="6" w:tplc="142C49AC">
       <w:start w:val="1"/>
       <w:numFmt w:val="decimal"/>
       <w:lvlText w:val="%7."/>
@@ -463,7 +999,7 @@
         <w:ind w:left="5040" w:hanging="360"/>
       </w:pPr>
     </w:lvl>
-    <w:lvl xmlns:w="http://schemas.openxmlformats.org/wordprocessingml/2006/main" w:ilvl="7">
+    <w:lvl w:ilvl="7" w:tplc="D1E86212">
       <w:start w:val="1"/>
       <w:numFmt w:val="lowerLetter"/>
       <w:lvlText w:val="%8."/>
@@ -472,7 +1008,7 @@
         <w:ind w:left="5760" w:hanging="360"/>
       </w:pPr>
     </w:lvl>
-    <w:lvl xmlns:w="http://schemas.openxmlformats.org/wordprocessingml/2006/main" w:ilvl="8">
+    <w:lvl w:ilvl="8" w:tplc="BDB68562">
       <w:start w:val="1"/>
       <w:numFmt w:val="lowerRoman"/>
       <w:lvlText w:val="%9."/>
@@ -482,20 +1018,142 @@
       </w:pPr>
     </w:lvl>
   </w:abstractNum>
-  <w:num w:numId="3">
+  <w:abstractNum w:abstractNumId="2" w15:restartNumberingAfterBreak="0">
+    <w:nsid w:val="75E15581"/>
+    <w:multiLevelType w:val="hybridMultilevel"/>
+    <w:tmpl w:val="FFFFFFFF"/>
+    <w:lvl w:ilvl="0" w:tplc="8A7E9F06">
+      <w:start w:val="1"/>
+      <w:numFmt w:val="bullet"/>
+      <w:lvlText w:val="-"/>
+      <w:lvlJc w:val="left"/>
+      <w:pPr>
+        <w:ind w:left="720" w:hanging="360"/>
+      </w:pPr>
+      <w:rPr>
+        <w:rFonts w:hint="default" w:ascii="Aptos" w:hAnsi="Aptos"/>
+      </w:rPr>
+    </w:lvl>
+    <w:lvl w:ilvl="1" w:tplc="3B64F43A">
+      <w:start w:val="1"/>
+      <w:numFmt w:val="bullet"/>
+      <w:lvlText w:val="o"/>
+      <w:lvlJc w:val="left"/>
+      <w:pPr>
+        <w:ind w:left="1440" w:hanging="360"/>
+      </w:pPr>
+      <w:rPr>
+        <w:rFonts w:hint="default" w:ascii="Courier New" w:hAnsi="Courier New"/>
+      </w:rPr>
+    </w:lvl>
+    <w:lvl w:ilvl="2" w:tplc="1C322D24">
+      <w:start w:val="1"/>
+      <w:numFmt w:val="bullet"/>
+      <w:lvlText w:val=""/>
+      <w:lvlJc w:val="left"/>
+      <w:pPr>
+        <w:ind w:left="2160" w:hanging="360"/>
+      </w:pPr>
+      <w:rPr>
+        <w:rFonts w:hint="default" w:ascii="Wingdings" w:hAnsi="Wingdings"/>
+      </w:rPr>
+    </w:lvl>
+    <w:lvl w:ilvl="3" w:tplc="22C89D84">
+      <w:start w:val="1"/>
+      <w:numFmt w:val="bullet"/>
+      <w:lvlText w:val=""/>
+      <w:lvlJc w:val="left"/>
+      <w:pPr>
+        <w:ind w:left="2880" w:hanging="360"/>
+      </w:pPr>
+      <w:rPr>
+        <w:rFonts w:hint="default" w:ascii="Symbol" w:hAnsi="Symbol"/>
+      </w:rPr>
+    </w:lvl>
+    <w:lvl w:ilvl="4" w:tplc="3D6E0E78">
+      <w:start w:val="1"/>
+      <w:numFmt w:val="bullet"/>
+      <w:lvlText w:val="o"/>
+      <w:lvlJc w:val="left"/>
+      <w:pPr>
+        <w:ind w:left="3600" w:hanging="360"/>
+      </w:pPr>
+      <w:rPr>
+        <w:rFonts w:hint="default" w:ascii="Courier New" w:hAnsi="Courier New"/>
+      </w:rPr>
+    </w:lvl>
+    <w:lvl w:ilvl="5" w:tplc="66B0E680">
+      <w:start w:val="1"/>
+      <w:numFmt w:val="bullet"/>
+      <w:lvlText w:val=""/>
+      <w:lvlJc w:val="left"/>
+      <w:pPr>
+        <w:ind w:left="4320" w:hanging="360"/>
+      </w:pPr>
+      <w:rPr>
+        <w:rFonts w:hint="default" w:ascii="Wingdings" w:hAnsi="Wingdings"/>
+      </w:rPr>
+    </w:lvl>
+    <w:lvl w:ilvl="6" w:tplc="767E5DBA">
+      <w:start w:val="1"/>
+      <w:numFmt w:val="bullet"/>
+      <w:lvlText w:val=""/>
+      <w:lvlJc w:val="left"/>
+      <w:pPr>
+        <w:ind w:left="5040" w:hanging="360"/>
+      </w:pPr>
+      <w:rPr>
+        <w:rFonts w:hint="default" w:ascii="Symbol" w:hAnsi="Symbol"/>
+      </w:rPr>
+    </w:lvl>
+    <w:lvl w:ilvl="7" w:tplc="FD403E12">
+      <w:start w:val="1"/>
+      <w:numFmt w:val="bullet"/>
+      <w:lvlText w:val="o"/>
+      <w:lvlJc w:val="left"/>
+      <w:pPr>
+        <w:ind w:left="5760" w:hanging="360"/>
+      </w:pPr>
+      <w:rPr>
+        <w:rFonts w:hint="default" w:ascii="Courier New" w:hAnsi="Courier New"/>
+      </w:rPr>
+    </w:lvl>
+    <w:lvl w:ilvl="8" w:tplc="C6064FD8">
+      <w:start w:val="1"/>
+      <w:numFmt w:val="bullet"/>
+      <w:lvlText w:val=""/>
+      <w:lvlJc w:val="left"/>
+      <w:pPr>
+        <w:ind w:left="6480" w:hanging="360"/>
+      </w:pPr>
+      <w:rPr>
+        <w:rFonts w:hint="default" w:ascii="Wingdings" w:hAnsi="Wingdings"/>
+      </w:rPr>
+    </w:lvl>
+  </w:abstractNum>
+  <w:num w:numId="6">
+    <w:abstractNumId w:val="5"/>
+  </w:num>
+  <w:num w:numId="5">
+    <w:abstractNumId w:val="4"/>
+  </w:num>
+  <w:num w:numId="4">
     <w:abstractNumId w:val="3"/>
   </w:num>
-  <w:num w:numId="2">
+  <w:num w:numId="1" w16cid:durableId="2008707745">
+    <w:abstractNumId w:val="0"/>
+  </w:num>
+  <w:num w:numId="2" w16cid:durableId="1814980228">
     <w:abstractNumId w:val="2"/>
   </w:num>
-  <w:num w:numId="1">
+  <w:num w:numId="3" w16cid:durableId="1066882904">
     <w:abstractNumId w:val="1"/>
   </w:num>
 </w:numbering>
 </file>
 
 <file path=word/styles.xml><?xml version="1.0" encoding="utf-8"?>
-<w:styles xmlns:w14="http://schemas.microsoft.com/office/word/2010/wordml" xmlns:wp14="http://schemas.microsoft.com/office/word/2010/wordprocessingDrawing" xmlns:r="http://schemas.openxmlformats.org/officeDocument/2006/relationships" xmlns:w="http://schemas.openxmlformats.org/wordprocessingml/2006/main" xmlns:mc="http://schemas.openxmlformats.org/markup-compatibility/2006" mc:Ignorable="w14 wp14">
+<w:styles xmlns:mc="http://schemas.openxmlformats.org/markup-compatibility/2006" xmlns:r="http://schemas.openxmlformats.org/officeDocument/2006/relationships" xmlns:w="http://schemas.openxmlformats.org/wordprocessingml/2006/main" xmlns:w14="http://schemas.microsoft.com/office/word/2010/wordml" xmlns:w15="http://schemas.microsoft.com/office/word/2012/wordml" xmlns:w16cex="http://schemas.microsoft.com/office/word/2018/wordml/cex" xmlns:w16cid="http://schemas.microsoft.com/office/word/2016/wordml/cid" xmlns:w16="http://schemas.microsoft.com/office/word/2018/wordml" xmlns:w16du="http://schemas.microsoft.com/office/word/2023/wordml/word16du" xmlns:w16sdtdh="http://schemas.microsoft.com/office/word/2020/wordml/sdtdatahash" xmlns:w16sdtfl="http://schemas.microsoft.com/office/word/2024/wordml/sdtformatlock" xmlns:w16se="http://schemas.microsoft.com/office/word/2015/wordml/symex" mc:Ignorable="w14 w15 w16se w16cid w16 w16cex w16sdtdh w16sdtfl w16du">
   <w:docDefaults>
     <w:rPrDefault>
       <w:rPr>
@@ -511,144 +1169,383 @@
       </w:pPr>
     </w:pPrDefault>
   </w:docDefaults>
-  <w:latentStyles w:defLockedState="0" w:defUIPriority="99" w:defSemiHidden="1" w:defUnhideWhenUsed="1" w:defQFormat="0" w:count="267">
-    <w:lsdException w:name="Normal" w:uiPriority="0" w:semiHidden="0" w:unhideWhenUsed="0" w:qFormat="1"/>
-    <w:lsdException w:name="heading 1" w:uiPriority="9" w:semiHidden="0" w:unhideWhenUsed="0" w:qFormat="1"/>
-    <w:lsdException w:name="heading 2" w:uiPriority="9" w:qFormat="1"/>
-    <w:lsdException w:name="heading 3" w:uiPriority="9" w:qFormat="1"/>
-    <w:lsdException w:name="heading 4" w:uiPriority="9" w:qFormat="1"/>
-    <w:lsdException w:name="heading 5" w:uiPriority="9" w:qFormat="1"/>
-    <w:lsdException w:name="heading 6" w:uiPriority="9" w:qFormat="1"/>
-    <w:lsdException w:name="heading 7" w:uiPriority="9" w:qFormat="1"/>
-    <w:lsdException w:name="heading 8" w:uiPriority="9" w:qFormat="1"/>
-    <w:lsdException w:name="heading 9" w:uiPriority="9" w:qFormat="1"/>
-    <w:lsdException w:name="toc 1" w:uiPriority="39"/>
-    <w:lsdException w:name="toc 2" w:uiPriority="39"/>
-    <w:lsdException w:name="toc 3" w:uiPriority="39"/>
-    <w:lsdException w:name="toc 4" w:uiPriority="39"/>
-    <w:lsdException w:name="toc 5" w:uiPriority="39"/>
-    <w:lsdException w:name="toc 6" w:uiPriority="39"/>
-    <w:lsdException w:name="toc 7" w:uiPriority="39"/>
-    <w:lsdException w:name="toc 8" w:uiPriority="39"/>
-    <w:lsdException w:name="toc 9" w:uiPriority="39"/>
-    <w:lsdException w:name="caption" w:uiPriority="35" w:qFormat="1"/>
-    <w:lsdException w:name="Title" w:uiPriority="10" w:semiHidden="0" w:unhideWhenUsed="0" w:qFormat="1"/>
-    <w:lsdException w:name="Default Paragraph Font" w:uiPriority="1"/>
-    <w:lsdException w:name="Subtitle" w:uiPriority="11" w:semiHidden="0" w:unhideWhenUsed="0" w:qFormat="1"/>
-    <w:lsdException w:name="Strong" w:uiPriority="22" w:semiHidden="0" w:unhideWhenUsed="0" w:qFormat="1"/>
-    <w:lsdException w:name="Emphasis" w:uiPriority="20" w:semiHidden="0" w:unhideWhenUsed="0" w:qFormat="1"/>
-    <w:lsdException w:name="Table Grid" w:uiPriority="59" w:semiHidden="0" w:unhideWhenUsed="0"/>
-    <w:lsdException w:name="Placeholder Text" w:unhideWhenUsed="0"/>
-    <w:lsdException w:name="No Spacing" w:uiPriority="1" w:semiHidden="0" w:unhideWhenUsed="0" w:qFormat="1"/>
-    <w:lsdException w:name="Light Shading" w:uiPriority="60" w:semiHidden="0" w:unhideWhenUsed="0"/>
-    <w:lsdException w:name="Light List" w:uiPriority="61" w:semiHidden="0" w:unhideWhenUsed="0"/>
-    <w:lsdException w:name="Light Grid" w:uiPriority="62" w:semiHidden="0" w:unhideWhenUsed="0"/>
-    <w:lsdException w:name="Medium Shading 1" w:uiPriority="63" w:semiHidden="0" w:unhideWhenUsed="0"/>
-    <w:lsdException w:name="Medium Shading 2" w:uiPriority="64" w:semiHidden="0" w:unhideWhenUsed="0"/>
-    <w:lsdException w:name="Medium List 1" w:uiPriority="65" w:semiHidden="0" w:unhideWhenUsed="0"/>
-    <w:lsdException w:name="Medium List 2" w:uiPriority="66" w:semiHidden="0" w:unhideWhenUsed="0"/>
-    <w:lsdException w:name="Medium Grid 1" w:uiPriority="67" w:semiHidden="0" w:unhideWhenUsed="0"/>
-    <w:lsdException w:name="Medium Grid 2" w:uiPriority="68" w:semiHidden="0" w:unhideWhenUsed="0"/>
-    <w:lsdException w:name="Medium Grid 3" w:uiPriority="69" w:semiHidden="0" w:unhideWhenUsed="0"/>
-    <w:lsdException w:name="Dark List" w:uiPriority="70" w:semiHidden="0" w:unhideWhenUsed="0"/>
-    <w:lsdException w:name="Colorful Shading" w:uiPriority="71" w:semiHidden="0" w:unhideWhenUsed="0"/>
-    <w:lsdException w:name="Colorful List" w:uiPriority="72" w:semiHidden="0" w:unhideWhenUsed="0"/>
-    <w:lsdException w:name="Colorful Grid" w:uiPriority="73" w:semiHidden="0" w:unhideWhenUsed="0"/>
-    <w:lsdException w:name="Light Shading Accent 1" w:uiPriority="60" w:semiHidden="0" w:unhideWhenUsed="0"/>
-    <w:lsdException w:name="Light List Accent 1" w:uiPriority="61" w:semiHidden="0" w:unhideWhenUsed="0"/>
-    <w:lsdException w:name="Light Grid Accent 1" w:uiPriority="62" w:semiHidden="0" w:unhideWhenUsed="0"/>
-    <w:lsdException w:name="Medium Shading 1 Accent 1" w:uiPriority="63" w:semiHidden="0" w:unhideWhenUsed="0"/>
-    <w:lsdException w:name="Medium Shading 2 Accent 1" w:uiPriority="64" w:semiHidden="0" w:unhideWhenUsed="0"/>
-    <w:lsdException w:name="Medium List 1 Accent 1" w:uiPriority="65" w:semiHidden="0" w:unhideWhenUsed="0"/>
-    <w:lsdException w:name="Revision" w:unhideWhenUsed="0"/>
-    <w:lsdException w:name="List Paragraph" w:uiPriority="34" w:semiHidden="0" w:unhideWhenUsed="0" w:qFormat="1"/>
-    <w:lsdException w:name="Quote" w:uiPriority="29" w:semiHidden="0" w:unhideWhenUsed="0" w:qFormat="1"/>
-    <w:lsdException w:name="Intense Quote" w:uiPriority="30" w:semiHidden="0" w:unhideWhenUsed="0" w:qFormat="1"/>
-    <w:lsdException w:name="Medium List 2 Accent 1" w:uiPriority="66" w:semiHidden="0" w:unhideWhenUsed="0"/>
-    <w:lsdException w:name="Medium Grid 1 Accent 1" w:uiPriority="67" w:semiHidden="0" w:unhideWhenUsed="0"/>
-    <w:lsdException w:name="Medium Grid 2 Accent 1" w:uiPriority="68" w:semiHidden="0" w:unhideWhenUsed="0"/>
-    <w:lsdException w:name="Medium Grid 3 Accent 1" w:uiPriority="69" w:semiHidden="0" w:unhideWhenUsed="0"/>
-    <w:lsdException w:name="Dark List Accent 1" w:uiPriority="70" w:semiHidden="0" w:unhideWhenUsed="0"/>
-    <w:lsdException w:name="Colorful Shading Accent 1" w:uiPriority="71" w:semiHidden="0" w:unhideWhenUsed="0"/>
-    <w:lsdException w:name="Colorful List Accent 1" w:uiPriority="72" w:semiHidden="0" w:unhideWhenUsed="0"/>
-    <w:lsdException w:name="Colorful Grid Accent 1" w:uiPriority="73" w:semiHidden="0" w:unhideWhenUsed="0"/>
-    <w:lsdException w:name="Light Shading Accent 2" w:uiPriority="60" w:semiHidden="0" w:unhideWhenUsed="0"/>
-    <w:lsdException w:name="Light List Accent 2" w:uiPriority="61" w:semiHidden="0" w:unhideWhenUsed="0"/>
-    <w:lsdException w:name="Light Grid Accent 2" w:uiPriority="62" w:semiHidden="0" w:unhideWhenUsed="0"/>
-    <w:lsdException w:name="Medium Shading 1 Accent 2" w:uiPriority="63" w:semiHidden="0" w:unhideWhenUsed="0"/>
-    <w:lsdException w:name="Medium Shading 2 Accent 2" w:uiPriority="64" w:semiHidden="0" w:unhideWhenUsed="0"/>
-    <w:lsdException w:name="Medium List 1 Accent 2" w:uiPriority="65" w:semiHidden="0" w:unhideWhenUsed="0"/>
-    <w:lsdException w:name="Medium List 2 Accent 2" w:uiPriority="66" w:semiHidden="0" w:unhideWhenUsed="0"/>
-    <w:lsdException w:name="Medium Grid 1 Accent 2" w:uiPriority="67" w:semiHidden="0" w:unhideWhenUsed="0"/>
-    <w:lsdException w:name="Medium Grid 2 Accent 2" w:uiPriority="68" w:semiHidden="0" w:unhideWhenUsed="0"/>
-    <w:lsdException w:name="Medium Grid 3 Accent 2" w:uiPriority="69" w:semiHidden="0" w:unhideWhenUsed="0"/>
-    <w:lsdException w:name="Dark List Accent 2" w:uiPriority="70" w:semiHidden="0" w:unhideWhenUsed="0"/>
-    <w:lsdException w:name="Colorful Shading Accent 2" w:uiPriority="71" w:semiHidden="0" w:unhideWhenUsed="0"/>
-    <w:lsdException w:name="Colorful List Accent 2" w:uiPriority="72" w:semiHidden="0" w:unhideWhenUsed="0"/>
-    <w:lsdException w:name="Colorful Grid Accent 2" w:uiPriority="73" w:semiHidden="0" w:unhideWhenUsed="0"/>
-    <w:lsdException w:name="Light Shading Accent 3" w:uiPriority="60" w:semiHidden="0" w:unhideWhenUsed="0"/>
-    <w:lsdException w:name="Light List Accent 3" w:uiPriority="61" w:semiHidden="0" w:unhideWhenUsed="0"/>
-    <w:lsdException w:name="Light Grid Accent 3" w:uiPriority="62" w:semiHidden="0" w:unhideWhenUsed="0"/>
-    <w:lsdException w:name="Medium Shading 1 Accent 3" w:uiPriority="63" w:semiHidden="0" w:unhideWhenUsed="0"/>
-    <w:lsdException w:name="Medium Shading 2 Accent 3" w:uiPriority="64" w:semiHidden="0" w:unhideWhenUsed="0"/>
-    <w:lsdException w:name="Medium List 1 Accent 3" w:uiPriority="65" w:semiHidden="0" w:unhideWhenUsed="0"/>
-    <w:lsdException w:name="Medium List 2 Accent 3" w:uiPriority="66" w:semiHidden="0" w:unhideWhenUsed="0"/>
-    <w:lsdException w:name="Medium Grid 1 Accent 3" w:uiPriority="67" w:semiHidden="0" w:unhideWhenUsed="0"/>
-    <w:lsdException w:name="Medium Grid 2 Accent 3" w:uiPriority="68" w:semiHidden="0" w:unhideWhenUsed="0"/>
-    <w:lsdException w:name="Medium Grid 3 Accent 3" w:uiPriority="69" w:semiHidden="0" w:unhideWhenUsed="0"/>
-    <w:lsdException w:name="Dark List Accent 3" w:uiPriority="70" w:semiHidden="0" w:unhideWhenUsed="0"/>
-    <w:lsdException w:name="Colorful Shading Accent 3" w:uiPriority="71" w:semiHidden="0" w:unhideWhenUsed="0"/>
-    <w:lsdException w:name="Colorful List Accent 3" w:uiPriority="72" w:semiHidden="0" w:unhideWhenUsed="0"/>
-    <w:lsdException w:name="Colorful Grid Accent 3" w:uiPriority="73" w:semiHidden="0" w:unhideWhenUsed="0"/>
-    <w:lsdException w:name="Light Shading Accent 4" w:uiPriority="60" w:semiHidden="0" w:unhideWhenUsed="0"/>
-    <w:lsdException w:name="Light List Accent 4" w:uiPriority="61" w:semiHidden="0" w:unhideWhenUsed="0"/>
-    <w:lsdException w:name="Light Grid Accent 4" w:uiPriority="62" w:semiHidden="0" w:unhideWhenUsed="0"/>
-    <w:lsdException w:name="Medium Shading 1 Accent 4" w:uiPriority="63" w:semiHidden="0" w:unhideWhenUsed="0"/>
-    <w:lsdException w:name="Medium Shading 2 Accent 4" w:uiPriority="64" w:semiHidden="0" w:unhideWhenUsed="0"/>
-    <w:lsdException w:name="Medium List 1 Accent 4" w:uiPriority="65" w:semiHidden="0" w:unhideWhenUsed="0"/>
-    <w:lsdException w:name="Medium List 2 Accent 4" w:uiPriority="66" w:semiHidden="0" w:unhideWhenUsed="0"/>
-    <w:lsdException w:name="Medium Grid 1 Accent 4" w:uiPriority="67" w:semiHidden="0" w:unhideWhenUsed="0"/>
-    <w:lsdException w:name="Medium Grid 2 Accent 4" w:uiPriority="68" w:semiHidden="0" w:unhideWhenUsed="0"/>
-    <w:lsdException w:name="Medium Grid 3 Accent 4" w:uiPriority="69" w:semiHidden="0" w:unhideWhenUsed="0"/>
-    <w:lsdException w:name="Dark List Accent 4" w:uiPriority="70" w:semiHidden="0" w:unhideWhenUsed="0"/>
-    <w:lsdException w:name="Colorful Shading Accent 4" w:uiPriority="71" w:semiHidden="0" w:unhideWhenUsed="0"/>
-    <w:lsdException w:name="Colorful List Accent 4" w:uiPriority="72" w:semiHidden="0" w:unhideWhenUsed="0"/>
-    <w:lsdException w:name="Colorful Grid Accent 4" w:uiPriority="73" w:semiHidden="0" w:unhideWhenUsed="0"/>
-    <w:lsdException w:name="Light Shading Accent 5" w:uiPriority="60" w:semiHidden="0" w:unhideWhenUsed="0"/>
-    <w:lsdException w:name="Light List Accent 5" w:uiPriority="61" w:semiHidden="0" w:unhideWhenUsed="0"/>
-    <w:lsdException w:name="Light Grid Accent 5" w:uiPriority="62" w:semiHidden="0" w:unhideWhenUsed="0"/>
-    <w:lsdException w:name="Medium Shading 1 Accent 5" w:uiPriority="63" w:semiHidden="0" w:unhideWhenUsed="0"/>
-    <w:lsdException w:name="Medium Shading 2 Accent 5" w:uiPriority="64" w:semiHidden="0" w:unhideWhenUsed="0"/>
-    <w:lsdException w:name="Medium List 1 Accent 5" w:uiPriority="65" w:semiHidden="0" w:unhideWhenUsed="0"/>
-    <w:lsdException w:name="Medium List 2 Accent 5" w:uiPriority="66" w:semiHidden="0" w:unhideWhenUsed="0"/>
-    <w:lsdException w:name="Medium Grid 1 Accent 5" w:uiPriority="67" w:semiHidden="0" w:unhideWhenUsed="0"/>
-    <w:lsdException w:name="Medium Grid 2 Accent 5" w:uiPriority="68" w:semiHidden="0" w:unhideWhenUsed="0"/>
-    <w:lsdException w:name="Medium Grid 3 Accent 5" w:uiPriority="69" w:semiHidden="0" w:unhideWhenUsed="0"/>
-    <w:lsdException w:name="Dark List Accent 5" w:uiPriority="70" w:semiHidden="0" w:unhideWhenUsed="0"/>
-    <w:lsdException w:name="Colorful Shading Accent 5" w:uiPriority="71" w:semiHidden="0" w:unhideWhenUsed="0"/>
-    <w:lsdException w:name="Colorful List Accent 5" w:uiPriority="72" w:semiHidden="0" w:unhideWhenUsed="0"/>
-    <w:lsdException w:name="Colorful Grid Accent 5" w:uiPriority="73" w:semiHidden="0" w:unhideWhenUsed="0"/>
-    <w:lsdException w:name="Light Shading Accent 6" w:uiPriority="60" w:semiHidden="0" w:unhideWhenUsed="0"/>
-    <w:lsdException w:name="Light List Accent 6" w:uiPriority="61" w:semiHidden="0" w:unhideWhenUsed="0"/>
-    <w:lsdException w:name="Light Grid Accent 6" w:uiPriority="62" w:semiHidden="0" w:unhideWhenUsed="0"/>
-    <w:lsdException w:name="Medium Shading 1 Accent 6" w:uiPriority="63" w:semiHidden="0" w:unhideWhenUsed="0"/>
-    <w:lsdException w:name="Medium Shading 2 Accent 6" w:uiPriority="64" w:semiHidden="0" w:unhideWhenUsed="0"/>
-    <w:lsdException w:name="Medium List 1 Accent 6" w:uiPriority="65" w:semiHidden="0" w:unhideWhenUsed="0"/>
-    <w:lsdException w:name="Medium List 2 Accent 6" w:uiPriority="66" w:semiHidden="0" w:unhideWhenUsed="0"/>
-    <w:lsdException w:name="Medium Grid 1 Accent 6" w:uiPriority="67" w:semiHidden="0" w:unhideWhenUsed="0"/>
-    <w:lsdException w:name="Medium Grid 2 Accent 6" w:uiPriority="68" w:semiHidden="0" w:unhideWhenUsed="0"/>
-    <w:lsdException w:name="Medium Grid 3 Accent 6" w:uiPriority="69" w:semiHidden="0" w:unhideWhenUsed="0"/>
-    <w:lsdException w:name="Dark List Accent 6" w:uiPriority="70" w:semiHidden="0" w:unhideWhenUsed="0"/>
-    <w:lsdException w:name="Colorful Shading Accent 6" w:uiPriority="71" w:semiHidden="0" w:unhideWhenUsed="0"/>
-    <w:lsdException w:name="Colorful List Accent 6" w:uiPriority="72" w:semiHidden="0" w:unhideWhenUsed="0"/>
-    <w:lsdException w:name="Colorful Grid Accent 6" w:uiPriority="73" w:semiHidden="0" w:unhideWhenUsed="0"/>
-    <w:lsdException w:name="Subtle Emphasis" w:uiPriority="19" w:semiHidden="0" w:unhideWhenUsed="0" w:qFormat="1"/>
-    <w:lsdException w:name="Intense Emphasis" w:uiPriority="21" w:semiHidden="0" w:unhideWhenUsed="0" w:qFormat="1"/>
-    <w:lsdException w:name="Subtle Reference" w:uiPriority="31" w:semiHidden="0" w:unhideWhenUsed="0" w:qFormat="1"/>
-    <w:lsdException w:name="Intense Reference" w:uiPriority="32" w:semiHidden="0" w:unhideWhenUsed="0" w:qFormat="1"/>
-    <w:lsdException w:name="Book Title" w:uiPriority="33" w:semiHidden="0" w:unhideWhenUsed="0" w:qFormat="1"/>
-    <w:lsdException w:name="Bibliography" w:uiPriority="37"/>
-    <w:lsdException w:name="TOC Heading" w:uiPriority="39" w:qFormat="1"/>
+  <w:latentStyles w:defLockedState="0" w:defUIPriority="99" w:defSemiHidden="0" w:defUnhideWhenUsed="0" w:defQFormat="0" w:count="376">
+    <w:lsdException w:name="Normal" w:uiPriority="0" w:qFormat="1"/>
+    <w:lsdException w:name="heading 1" w:uiPriority="9" w:qFormat="1"/>
+    <w:lsdException w:name="heading 2" w:uiPriority="9" w:semiHidden="1" w:unhideWhenUsed="1" w:qFormat="1"/>
+    <w:lsdException w:name="heading 3" w:uiPriority="9" w:semiHidden="1" w:unhideWhenUsed="1" w:qFormat="1"/>
+    <w:lsdException w:name="heading 4" w:uiPriority="9" w:semiHidden="1" w:unhideWhenUsed="1" w:qFormat="1"/>
+    <w:lsdException w:name="heading 5" w:uiPriority="9" w:semiHidden="1" w:unhideWhenUsed="1" w:qFormat="1"/>
+    <w:lsdException w:name="heading 6" w:uiPriority="9" w:semiHidden="1" w:unhideWhenUsed="1" w:qFormat="1"/>
+    <w:lsdException w:name="heading 7" w:uiPriority="9" w:semiHidden="1" w:unhideWhenUsed="1" w:qFormat="1"/>
+    <w:lsdException w:name="heading 8" w:uiPriority="9" w:semiHidden="1" w:unhideWhenUsed="1" w:qFormat="1"/>
+    <w:lsdException w:name="heading 9" w:uiPriority="9" w:semiHidden="1" w:unhideWhenUsed="1" w:qFormat="1"/>
+    <w:lsdException w:name="index 1" w:semiHidden="1" w:unhideWhenUsed="1"/>
+    <w:lsdException w:name="index 2" w:semiHidden="1" w:unhideWhenUsed="1"/>
+    <w:lsdException w:name="index 3" w:semiHidden="1" w:unhideWhenUsed="1"/>
+    <w:lsdException w:name="index 4" w:semiHidden="1" w:unhideWhenUsed="1"/>
+    <w:lsdException w:name="index 5" w:semiHidden="1" w:unhideWhenUsed="1"/>
+    <w:lsdException w:name="index 6" w:semiHidden="1" w:unhideWhenUsed="1"/>
+    <w:lsdException w:name="index 7" w:semiHidden="1" w:unhideWhenUsed="1"/>
+    <w:lsdException w:name="index 8" w:semiHidden="1" w:unhideWhenUsed="1"/>
+    <w:lsdException w:name="index 9" w:semiHidden="1" w:unhideWhenUsed="1"/>
+    <w:lsdException w:name="toc 1" w:uiPriority="39" w:semiHidden="1" w:unhideWhenUsed="1"/>
+    <w:lsdException w:name="toc 2" w:uiPriority="39" w:semiHidden="1" w:unhideWhenUsed="1"/>
+    <w:lsdException w:name="toc 3" w:uiPriority="39" w:semiHidden="1" w:unhideWhenUsed="1"/>
+    <w:lsdException w:name="toc 4" w:uiPriority="39" w:semiHidden="1" w:unhideWhenUsed="1"/>
+    <w:lsdException w:name="toc 5" w:uiPriority="39" w:semiHidden="1" w:unhideWhenUsed="1"/>
+    <w:lsdException w:name="toc 6" w:uiPriority="39" w:semiHidden="1" w:unhideWhenUsed="1"/>
+    <w:lsdException w:name="toc 7" w:uiPriority="39" w:semiHidden="1" w:unhideWhenUsed="1"/>
+    <w:lsdException w:name="toc 8" w:uiPriority="39" w:semiHidden="1" w:unhideWhenUsed="1"/>
+    <w:lsdException w:name="toc 9" w:uiPriority="39" w:semiHidden="1" w:unhideWhenUsed="1"/>
+    <w:lsdException w:name="Normal Indent" w:semiHidden="1" w:unhideWhenUsed="1"/>
+    <w:lsdException w:name="footnote text" w:semiHidden="1" w:unhideWhenUsed="1"/>
+    <w:lsdException w:name="annotation text" w:semiHidden="1" w:unhideWhenUsed="1"/>
+    <w:lsdException w:name="header" w:semiHidden="1" w:unhideWhenUsed="1"/>
+    <w:lsdException w:name="footer" w:semiHidden="1" w:unhideWhenUsed="1"/>
+    <w:lsdException w:name="index heading" w:semiHidden="1" w:unhideWhenUsed="1"/>
+    <w:lsdException w:name="caption" w:uiPriority="35" w:semiHidden="1" w:unhideWhenUsed="1" w:qFormat="1"/>
+    <w:lsdException w:name="table of figures" w:semiHidden="1" w:unhideWhenUsed="1"/>
+    <w:lsdException w:name="envelope address" w:semiHidden="1" w:unhideWhenUsed="1"/>
+    <w:lsdException w:name="envelope return" w:semiHidden="1" w:unhideWhenUsed="1"/>
+    <w:lsdException w:name="footnote reference" w:semiHidden="1" w:unhideWhenUsed="1"/>
+    <w:lsdException w:name="annotation reference" w:semiHidden="1" w:unhideWhenUsed="1"/>
+    <w:lsdException w:name="line number" w:semiHidden="1" w:unhideWhenUsed="1"/>
+    <w:lsdException w:name="page number" w:semiHidden="1" w:unhideWhenUsed="1"/>
+    <w:lsdException w:name="endnote reference" w:semiHidden="1" w:unhideWhenUsed="1"/>
+    <w:lsdException w:name="endnote text" w:semiHidden="1" w:unhideWhenUsed="1"/>
+    <w:lsdException w:name="table of authorities" w:semiHidden="1" w:unhideWhenUsed="1"/>
+    <w:lsdException w:name="macro" w:semiHidden="1" w:unhideWhenUsed="1"/>
+    <w:lsdException w:name="toa heading" w:semiHidden="1" w:unhideWhenUsed="1"/>
+    <w:lsdException w:name="List" w:semiHidden="1" w:unhideWhenUsed="1"/>
+    <w:lsdException w:name="List Bullet" w:semiHidden="1" w:unhideWhenUsed="1"/>
+    <w:lsdException w:name="List Number" w:semiHidden="1" w:unhideWhenUsed="1"/>
+    <w:lsdException w:name="List 2" w:semiHidden="1" w:unhideWhenUsed="1"/>
+    <w:lsdException w:name="List 3" w:semiHidden="1" w:unhideWhenUsed="1"/>
+    <w:lsdException w:name="List 4" w:semiHidden="1" w:unhideWhenUsed="1"/>
+    <w:lsdException w:name="List 5" w:semiHidden="1" w:unhideWhenUsed="1"/>
+    <w:lsdException w:name="List Bullet 2" w:semiHidden="1" w:unhideWhenUsed="1"/>
+    <w:lsdException w:name="List Bullet 3" w:semiHidden="1" w:unhideWhenUsed="1"/>
+    <w:lsdException w:name="List Bullet 4" w:semiHidden="1" w:unhideWhenUsed="1"/>
+    <w:lsdException w:name="List Bullet 5" w:semiHidden="1" w:unhideWhenUsed="1"/>
+    <w:lsdException w:name="List Number 2" w:semiHidden="1" w:unhideWhenUsed="1"/>
+    <w:lsdException w:name="List Number 3" w:semiHidden="1" w:unhideWhenUsed="1"/>
+    <w:lsdException w:name="List Number 4" w:semiHidden="1" w:unhideWhenUsed="1"/>
+    <w:lsdException w:name="List Number 5" w:semiHidden="1" w:unhideWhenUsed="1"/>
+    <w:lsdException w:name="Title" w:uiPriority="10" w:qFormat="1"/>
+    <w:lsdException w:name="Closing" w:semiHidden="1" w:unhideWhenUsed="1"/>
+    <w:lsdException w:name="Signature" w:semiHidden="1" w:unhideWhenUsed="1"/>
+    <w:lsdException w:name="Default Paragraph Font" w:uiPriority="1" w:semiHidden="1" w:unhideWhenUsed="1"/>
+    <w:lsdException w:name="Body Text" w:semiHidden="1" w:unhideWhenUsed="1"/>
+    <w:lsdException w:name="Body Text Indent" w:semiHidden="1" w:unhideWhenUsed="1"/>
+    <w:lsdException w:name="List Continue" w:semiHidden="1" w:unhideWhenUsed="1"/>
+    <w:lsdException w:name="List Continue 2" w:semiHidden="1" w:unhideWhenUsed="1"/>
+    <w:lsdException w:name="List Continue 3" w:semiHidden="1" w:unhideWhenUsed="1"/>
+    <w:lsdException w:name="List Continue 4" w:semiHidden="1" w:unhideWhenUsed="1"/>
+    <w:lsdException w:name="List Continue 5" w:semiHidden="1" w:unhideWhenUsed="1"/>
+    <w:lsdException w:name="Message Header" w:semiHidden="1" w:unhideWhenUsed="1"/>
+    <w:lsdException w:name="Subtitle" w:uiPriority="11" w:qFormat="1"/>
+    <w:lsdException w:name="Salutation" w:semiHidden="1" w:unhideWhenUsed="1"/>
+    <w:lsdException w:name="Date" w:semiHidden="1" w:unhideWhenUsed="1"/>
+    <w:lsdException w:name="Body Text First Indent" w:semiHidden="1" w:unhideWhenUsed="1"/>
+    <w:lsdException w:name="Body Text First Indent 2" w:semiHidden="1" w:unhideWhenUsed="1"/>
+    <w:lsdException w:name="Note Heading" w:semiHidden="1" w:unhideWhenUsed="1"/>
+    <w:lsdException w:name="Body Text 2" w:semiHidden="1" w:unhideWhenUsed="1"/>
+    <w:lsdException w:name="Body Text 3" w:semiHidden="1" w:unhideWhenUsed="1"/>
+    <w:lsdException w:name="Body Text Indent 2" w:semiHidden="1" w:unhideWhenUsed="1"/>
+    <w:lsdException w:name="Body Text Indent 3" w:semiHidden="1" w:unhideWhenUsed="1"/>
+    <w:lsdException w:name="Block Text" w:semiHidden="1" w:unhideWhenUsed="1"/>
+    <w:lsdException w:name="Hyperlink" w:semiHidden="1" w:unhideWhenUsed="1"/>
+    <w:lsdException w:name="FollowedHyperlink" w:semiHidden="1" w:unhideWhenUsed="1"/>
+    <w:lsdException w:name="Strong" w:uiPriority="22" w:qFormat="1"/>
+    <w:lsdException w:name="Emphasis" w:uiPriority="20" w:qFormat="1"/>
+    <w:lsdException w:name="Document Map" w:semiHidden="1" w:unhideWhenUsed="1"/>
+    <w:lsdException w:name="Plain Text" w:semiHidden="1" w:unhideWhenUsed="1"/>
+    <w:lsdException w:name="E-mail Signature" w:semiHidden="1" w:unhideWhenUsed="1"/>
+    <w:lsdException w:name="HTML Top of Form" w:semiHidden="1" w:unhideWhenUsed="1"/>
+    <w:lsdException w:name="HTML Bottom of Form" w:semiHidden="1" w:unhideWhenUsed="1"/>
+    <w:lsdException w:name="Normal (Web)" w:semiHidden="1" w:unhideWhenUsed="1"/>
+    <w:lsdException w:name="HTML Acronym" w:semiHidden="1" w:unhideWhenUsed="1"/>
+    <w:lsdException w:name="HTML Address" w:semiHidden="1" w:unhideWhenUsed="1"/>
+    <w:lsdException w:name="HTML Cite" w:semiHidden="1" w:unhideWhenUsed="1"/>
+    <w:lsdException w:name="HTML Code" w:semiHidden="1" w:unhideWhenUsed="1"/>
+    <w:lsdException w:name="HTML Definition" w:semiHidden="1" w:unhideWhenUsed="1"/>
+    <w:lsdException w:name="HTML Keyboard" w:semiHidden="1" w:unhideWhenUsed="1"/>
+    <w:lsdException w:name="HTML Preformatted" w:semiHidden="1" w:unhideWhenUsed="1"/>
+    <w:lsdException w:name="HTML Sample" w:semiHidden="1" w:unhideWhenUsed="1"/>
+    <w:lsdException w:name="HTML Typewriter" w:semiHidden="1" w:unhideWhenUsed="1"/>
+    <w:lsdException w:name="HTML Variable" w:semiHidden="1" w:unhideWhenUsed="1"/>
+    <w:lsdException w:name="Normal Table" w:semiHidden="1" w:unhideWhenUsed="1"/>
+    <w:lsdException w:name="annotation subject" w:semiHidden="1" w:unhideWhenUsed="1"/>
+    <w:lsdException w:name="No List" w:semiHidden="1" w:unhideWhenUsed="1"/>
+    <w:lsdException w:name="Outline List 1" w:semiHidden="1" w:unhideWhenUsed="1"/>
+    <w:lsdException w:name="Outline List 2" w:semiHidden="1" w:unhideWhenUsed="1"/>
+    <w:lsdException w:name="Outline List 3" w:semiHidden="1" w:unhideWhenUsed="1"/>
+    <w:lsdException w:name="Table Simple 1" w:semiHidden="1" w:unhideWhenUsed="1"/>
+    <w:lsdException w:name="Table Simple 2" w:semiHidden="1" w:unhideWhenUsed="1"/>
+    <w:lsdException w:name="Table Simple 3" w:semiHidden="1" w:unhideWhenUsed="1"/>
+    <w:lsdException w:name="Table Classic 1" w:semiHidden="1" w:unhideWhenUsed="1"/>
+    <w:lsdException w:name="Table Classic 2" w:semiHidden="1" w:unhideWhenUsed="1"/>
+    <w:lsdException w:name="Table Classic 3" w:semiHidden="1" w:unhideWhenUsed="1"/>
+    <w:lsdException w:name="Table Classic 4" w:semiHidden="1" w:unhideWhenUsed="1"/>
+    <w:lsdException w:name="Table Colorful 1" w:semiHidden="1" w:unhideWhenUsed="1"/>
+    <w:lsdException w:name="Table Colorful 2" w:semiHidden="1" w:unhideWhenUsed="1"/>
+    <w:lsdException w:name="Table Colorful 3" w:semiHidden="1" w:unhideWhenUsed="1"/>
+    <w:lsdException w:name="Table Columns 1" w:semiHidden="1" w:unhideWhenUsed="1"/>
+    <w:lsdException w:name="Table Columns 2" w:semiHidden="1" w:unhideWhenUsed="1"/>
+    <w:lsdException w:name="Table Columns 3" w:semiHidden="1" w:unhideWhenUsed="1"/>
+    <w:lsdException w:name="Table Columns 4" w:semiHidden="1" w:unhideWhenUsed="1"/>
+    <w:lsdException w:name="Table Columns 5" w:semiHidden="1" w:unhideWhenUsed="1"/>
+    <w:lsdException w:name="Table Grid 1" w:semiHidden="1" w:unhideWhenUsed="1"/>
+    <w:lsdException w:name="Table Grid 2" w:semiHidden="1" w:unhideWhenUsed="1"/>
+    <w:lsdException w:name="Table Grid 3" w:semiHidden="1" w:unhideWhenUsed="1"/>
+    <w:lsdException w:name="Table Grid 4" w:semiHidden="1" w:unhideWhenUsed="1"/>
+    <w:lsdException w:name="Table Grid 5" w:semiHidden="1" w:unhideWhenUsed="1"/>
+    <w:lsdException w:name="Table Grid 6" w:semiHidden="1" w:unhideWhenUsed="1"/>
+    <w:lsdException w:name="Table Grid 7" w:semiHidden="1" w:unhideWhenUsed="1"/>
+    <w:lsdException w:name="Table Grid 8" w:semiHidden="1" w:unhideWhenUsed="1"/>
+    <w:lsdException w:name="Table List 1" w:semiHidden="1" w:unhideWhenUsed="1"/>
+    <w:lsdException w:name="Table List 2" w:semiHidden="1" w:unhideWhenUsed="1"/>
+    <w:lsdException w:name="Table List 3" w:semiHidden="1" w:unhideWhenUsed="1"/>
+    <w:lsdException w:name="Table List 4" w:semiHidden="1" w:unhideWhenUsed="1"/>
+    <w:lsdException w:name="Table List 5" w:semiHidden="1" w:unhideWhenUsed="1"/>
+    <w:lsdException w:name="Table List 6" w:semiHidden="1" w:unhideWhenUsed="1"/>
+    <w:lsdException w:name="Table List 7" w:semiHidden="1" w:unhideWhenUsed="1"/>
+    <w:lsdException w:name="Table List 8" w:semiHidden="1" w:unhideWhenUsed="1"/>
+    <w:lsdException w:name="Table 3D effects 1" w:semiHidden="1" w:unhideWhenUsed="1"/>
+    <w:lsdException w:name="Table 3D effects 2" w:semiHidden="1" w:unhideWhenUsed="1"/>
+    <w:lsdException w:name="Table 3D effects 3" w:semiHidden="1" w:unhideWhenUsed="1"/>
+    <w:lsdException w:name="Table Contemporary" w:semiHidden="1" w:unhideWhenUsed="1"/>
+    <w:lsdException w:name="Table Elegant" w:semiHidden="1" w:unhideWhenUsed="1"/>
+    <w:lsdException w:name="Table Professional" w:semiHidden="1" w:unhideWhenUsed="1"/>
+    <w:lsdException w:name="Table Subtle 1" w:semiHidden="1" w:unhideWhenUsed="1"/>
+    <w:lsdException w:name="Table Subtle 2" w:semiHidden="1" w:unhideWhenUsed="1"/>
+    <w:lsdException w:name="Table Web 1" w:semiHidden="1" w:unhideWhenUsed="1"/>
+    <w:lsdException w:name="Table Web 2" w:semiHidden="1" w:unhideWhenUsed="1"/>
+    <w:lsdException w:name="Table Web 3" w:semiHidden="1" w:unhideWhenUsed="1"/>
+    <w:lsdException w:name="Balloon Text" w:semiHidden="1" w:unhideWhenUsed="1"/>
+    <w:lsdException w:name="Table Grid" w:uiPriority="59"/>
+    <w:lsdException w:name="Table Theme" w:semiHidden="1" w:unhideWhenUsed="1"/>
+    <w:lsdException w:name="Placeholder Text" w:semiHidden="1"/>
+    <w:lsdException w:name="No Spacing" w:uiPriority="1" w:qFormat="1"/>
+    <w:lsdException w:name="Light Shading" w:uiPriority="60"/>
+    <w:lsdException w:name="Light List" w:uiPriority="61"/>
+    <w:lsdException w:name="Light Grid" w:uiPriority="62"/>
+    <w:lsdException w:name="Medium Shading 1" w:uiPriority="63"/>
+    <w:lsdException w:name="Medium Shading 2" w:uiPriority="64"/>
+    <w:lsdException w:name="Medium List 1" w:uiPriority="65"/>
+    <w:lsdException w:name="Medium List 2" w:uiPriority="66"/>
+    <w:lsdException w:name="Medium Grid 1" w:uiPriority="67"/>
+    <w:lsdException w:name="Medium Grid 2" w:uiPriority="68"/>
+    <w:lsdException w:name="Medium Grid 3" w:uiPriority="69"/>
+    <w:lsdException w:name="Dark List" w:uiPriority="70"/>
+    <w:lsdException w:name="Colorful Shading" w:uiPriority="71"/>
+    <w:lsdException w:name="Colorful List" w:uiPriority="72"/>
+    <w:lsdException w:name="Colorful Grid" w:uiPriority="73"/>
+    <w:lsdException w:name="Light Shading Accent 1" w:uiPriority="60"/>
+    <w:lsdException w:name="Light List Accent 1" w:uiPriority="61"/>
+    <w:lsdException w:name="Light Grid Accent 1" w:uiPriority="62"/>
+    <w:lsdException w:name="Medium Shading 1 Accent 1" w:uiPriority="63"/>
+    <w:lsdException w:name="Medium Shading 2 Accent 1" w:uiPriority="64"/>
+    <w:lsdException w:name="Medium List 1 Accent 1" w:uiPriority="65"/>
+    <w:lsdException w:name="Revision" w:semiHidden="1"/>
+    <w:lsdException w:name="List Paragraph" w:uiPriority="34" w:qFormat="1"/>
+    <w:lsdException w:name="Quote" w:uiPriority="29" w:qFormat="1"/>
+    <w:lsdException w:name="Intense Quote" w:uiPriority="30" w:qFormat="1"/>
+    <w:lsdException w:name="Medium List 2 Accent 1" w:uiPriority="66"/>
+    <w:lsdException w:name="Medium Grid 1 Accent 1" w:uiPriority="67"/>
+    <w:lsdException w:name="Medium Grid 2 Accent 1" w:uiPriority="68"/>
+    <w:lsdException w:name="Medium Grid 3 Accent 1" w:uiPriority="69"/>
+    <w:lsdException w:name="Dark List Accent 1" w:uiPriority="70"/>
+    <w:lsdException w:name="Colorful Shading Accent 1" w:uiPriority="71"/>
+    <w:lsdException w:name="Colorful List Accent 1" w:uiPriority="72"/>
+    <w:lsdException w:name="Colorful Grid Accent 1" w:uiPriority="73"/>
+    <w:lsdException w:name="Light Shading Accent 2" w:uiPriority="60"/>
+    <w:lsdException w:name="Light List Accent 2" w:uiPriority="61"/>
+    <w:lsdException w:name="Light Grid Accent 2" w:uiPriority="62"/>
+    <w:lsdException w:name="Medium Shading 1 Accent 2" w:uiPriority="63"/>
+    <w:lsdException w:name="Medium Shading 2 Accent 2" w:uiPriority="64"/>
+    <w:lsdException w:name="Medium List 1 Accent 2" w:uiPriority="65"/>
+    <w:lsdException w:name="Medium List 2 Accent 2" w:uiPriority="66"/>
+    <w:lsdException w:name="Medium Grid 1 Accent 2" w:uiPriority="67"/>
+    <w:lsdException w:name="Medium Grid 2 Accent 2" w:uiPriority="68"/>
+    <w:lsdException w:name="Medium Grid 3 Accent 2" w:uiPriority="69"/>
+    <w:lsdException w:name="Dark List Accent 2" w:uiPriority="70"/>
+    <w:lsdException w:name="Colorful Shading Accent 2" w:uiPriority="71"/>
+    <w:lsdException w:name="Colorful List Accent 2" w:uiPriority="72"/>
+    <w:lsdException w:name="Colorful Grid Accent 2" w:uiPriority="73"/>
+    <w:lsdException w:name="Light Shading Accent 3" w:uiPriority="60"/>
+    <w:lsdException w:name="Light List Accent 3" w:uiPriority="61"/>
+    <w:lsdException w:name="Light Grid Accent 3" w:uiPriority="62"/>
+    <w:lsdException w:name="Medium Shading 1 Accent 3" w:uiPriority="63"/>
+    <w:lsdException w:name="Medium Shading 2 Accent 3" w:uiPriority="64"/>
+    <w:lsdException w:name="Medium List 1 Accent 3" w:uiPriority="65"/>
+    <w:lsdException w:name="Medium List 2 Accent 3" w:uiPriority="66"/>
+    <w:lsdException w:name="Medium Grid 1 Accent 3" w:uiPriority="67"/>
+    <w:lsdException w:name="Medium Grid 2 Accent 3" w:uiPriority="68"/>
+    <w:lsdException w:name="Medium Grid 3 Accent 3" w:uiPriority="69"/>
+    <w:lsdException w:name="Dark List Accent 3" w:uiPriority="70"/>
+    <w:lsdException w:name="Colorful Shading Accent 3" w:uiPriority="71"/>
+    <w:lsdException w:name="Colorful List Accent 3" w:uiPriority="72"/>
+    <w:lsdException w:name="Colorful Grid Accent 3" w:uiPriority="73"/>
+    <w:lsdException w:name="Light Shading Accent 4" w:uiPriority="60"/>
+    <w:lsdException w:name="Light List Accent 4" w:uiPriority="61"/>
+    <w:lsdException w:name="Light Grid Accent 4" w:uiPriority="62"/>
+    <w:lsdException w:name="Medium Shading 1 Accent 4" w:uiPriority="63"/>
+    <w:lsdException w:name="Medium Shading 2 Accent 4" w:uiPriority="64"/>
+    <w:lsdException w:name="Medium List 1 Accent 4" w:uiPriority="65"/>
+    <w:lsdException w:name="Medium List 2 Accent 4" w:uiPriority="66"/>
+    <w:lsdException w:name="Medium Grid 1 Accent 4" w:uiPriority="67"/>
+    <w:lsdException w:name="Medium Grid 2 Accent 4" w:uiPriority="68"/>
+    <w:lsdException w:name="Medium Grid 3 Accent 4" w:uiPriority="69"/>
+    <w:lsdException w:name="Dark List Accent 4" w:uiPriority="70"/>
+    <w:lsdException w:name="Colorful Shading Accent 4" w:uiPriority="71"/>
+    <w:lsdException w:name="Colorful List Accent 4" w:uiPriority="72"/>
+    <w:lsdException w:name="Colorful Grid Accent 4" w:uiPriority="73"/>
+    <w:lsdException w:name="Light Shading Accent 5" w:uiPriority="60"/>
+    <w:lsdException w:name="Light List Accent 5" w:uiPriority="61"/>
+    <w:lsdException w:name="Light Grid Accent 5" w:uiPriority="62"/>
+    <w:lsdException w:name="Medium Shading 1 Accent 5" w:uiPriority="63"/>
+    <w:lsdException w:name="Medium Shading 2 Accent 5" w:uiPriority="64"/>
+    <w:lsdException w:name="Medium List 1 Accent 5" w:uiPriority="65"/>
+    <w:lsdException w:name="Medium List 2 Accent 5" w:uiPriority="66"/>
+    <w:lsdException w:name="Medium Grid 1 Accent 5" w:uiPriority="67"/>
+    <w:lsdException w:name="Medium Grid 2 Accent 5" w:uiPriority="68"/>
+    <w:lsdException w:name="Medium Grid 3 Accent 5" w:uiPriority="69"/>
+    <w:lsdException w:name="Dark List Accent 5" w:uiPriority="70"/>
+    <w:lsdException w:name="Colorful Shading Accent 5" w:uiPriority="71"/>
+    <w:lsdException w:name="Colorful List Accent 5" w:uiPriority="72"/>
+    <w:lsdException w:name="Colorful Grid Accent 5" w:uiPriority="73"/>
+    <w:lsdException w:name="Light Shading Accent 6" w:uiPriority="60"/>
+    <w:lsdException w:name="Light List Accent 6" w:uiPriority="61"/>
+    <w:lsdException w:name="Light Grid Accent 6" w:uiPriority="62"/>
+    <w:lsdException w:name="Medium Shading 1 Accent 6" w:uiPriority="63"/>
+    <w:lsdException w:name="Medium Shading 2 Accent 6" w:uiPriority="64"/>
+    <w:lsdException w:name="Medium List 1 Accent 6" w:uiPriority="65"/>
+    <w:lsdException w:name="Medium List 2 Accent 6" w:uiPriority="66"/>
+    <w:lsdException w:name="Medium Grid 1 Accent 6" w:uiPriority="67"/>
+    <w:lsdException w:name="Medium Grid 2 Accent 6" w:uiPriority="68"/>
+    <w:lsdException w:name="Medium Grid 3 Accent 6" w:uiPriority="69"/>
+    <w:lsdException w:name="Dark List Accent 6" w:uiPriority="70"/>
+    <w:lsdException w:name="Colorful Shading Accent 6" w:uiPriority="71"/>
+    <w:lsdException w:name="Colorful List Accent 6" w:uiPriority="72"/>
+    <w:lsdException w:name="Colorful Grid Accent 6" w:uiPriority="73"/>
+    <w:lsdException w:name="Subtle Emphasis" w:uiPriority="19" w:qFormat="1"/>
+    <w:lsdException w:name="Intense Emphasis" w:uiPriority="21" w:qFormat="1"/>
+    <w:lsdException w:name="Subtle Reference" w:uiPriority="31" w:qFormat="1"/>
+    <w:lsdException w:name="Intense Reference" w:uiPriority="32" w:qFormat="1"/>
+    <w:lsdException w:name="Book Title" w:uiPriority="33" w:qFormat="1"/>
+    <w:lsdException w:name="Bibliography" w:uiPriority="37" w:semiHidden="1" w:unhideWhenUsed="1"/>
+    <w:lsdException w:name="TOC Heading" w:uiPriority="39" w:semiHidden="1" w:unhideWhenUsed="1" w:qFormat="1"/>
+    <w:lsdException w:name="Plain Table 1" w:uiPriority="41"/>
+    <w:lsdException w:name="Plain Table 2" w:uiPriority="42"/>
+    <w:lsdException w:name="Plain Table 3" w:uiPriority="43"/>
+    <w:lsdException w:name="Plain Table 4" w:uiPriority="44"/>
+    <w:lsdException w:name="Plain Table 5" w:uiPriority="45"/>
+    <w:lsdException w:name="Grid Table Light" w:uiPriority="40"/>
+    <w:lsdException w:name="Grid Table 1 Light" w:uiPriority="46"/>
+    <w:lsdException w:name="Grid Table 2" w:uiPriority="47"/>
+    <w:lsdException w:name="Grid Table 3" w:uiPriority="48"/>
+    <w:lsdException w:name="Grid Table 4" w:uiPriority="49"/>
+    <w:lsdException w:name="Grid Table 5 Dark" w:uiPriority="50"/>
+    <w:lsdException w:name="Grid Table 6 Colorful" w:uiPriority="51"/>
+    <w:lsdException w:name="Grid Table 7 Colorful" w:uiPriority="52"/>
+    <w:lsdException w:name="Grid Table 1 Light Accent 1" w:uiPriority="46"/>
+    <w:lsdException w:name="Grid Table 2 Accent 1" w:uiPriority="47"/>
+    <w:lsdException w:name="Grid Table 3 Accent 1" w:uiPriority="48"/>
+    <w:lsdException w:name="Grid Table 4 Accent 1" w:uiPriority="49"/>
+    <w:lsdException w:name="Grid Table 5 Dark Accent 1" w:uiPriority="50"/>
+    <w:lsdException w:name="Grid Table 6 Colorful Accent 1" w:uiPriority="51"/>
+    <w:lsdException w:name="Grid Table 7 Colorful Accent 1" w:uiPriority="52"/>
+    <w:lsdException w:name="Grid Table 1 Light Accent 2" w:uiPriority="46"/>
+    <w:lsdException w:name="Grid Table 2 Accent 2" w:uiPriority="47"/>
+    <w:lsdException w:name="Grid Table 3 Accent 2" w:uiPriority="48"/>
+    <w:lsdException w:name="Grid Table 4 Accent 2" w:uiPriority="49"/>
+    <w:lsdException w:name="Grid Table 5 Dark Accent 2" w:uiPriority="50"/>
+    <w:lsdException w:name="Grid Table 6 Colorful Accent 2" w:uiPriority="51"/>
+    <w:lsdException w:name="Grid Table 7 Colorful Accent 2" w:uiPriority="52"/>
+    <w:lsdException w:name="Grid Table 1 Light Accent 3" w:uiPriority="46"/>
+    <w:lsdException w:name="Grid Table 2 Accent 3" w:uiPriority="47"/>
+    <w:lsdException w:name="Grid Table 3 Accent 3" w:uiPriority="48"/>
+    <w:lsdException w:name="Grid Table 4 Accent 3" w:uiPriority="49"/>
+    <w:lsdException w:name="Grid Table 5 Dark Accent 3" w:uiPriority="50"/>
+    <w:lsdException w:name="Grid Table 6 Colorful Accent 3" w:uiPriority="51"/>
+    <w:lsdException w:name="Grid Table 7 Colorful Accent 3" w:uiPriority="52"/>
+    <w:lsdException w:name="Grid Table 1 Light Accent 4" w:uiPriority="46"/>
+    <w:lsdException w:name="Grid Table 2 Accent 4" w:uiPriority="47"/>
+    <w:lsdException w:name="Grid Table 3 Accent 4" w:uiPriority="48"/>
+    <w:lsdException w:name="Grid Table 4 Accent 4" w:uiPriority="49"/>
+    <w:lsdException w:name="Grid Table 5 Dark Accent 4" w:uiPriority="50"/>
+    <w:lsdException w:name="Grid Table 6 Colorful Accent 4" w:uiPriority="51"/>
+    <w:lsdException w:name="Grid Table 7 Colorful Accent 4" w:uiPriority="52"/>
+    <w:lsdException w:name="Grid Table 1 Light Accent 5" w:uiPriority="46"/>
+    <w:lsdException w:name="Grid Table 2 Accent 5" w:uiPriority="47"/>
+    <w:lsdException w:name="Grid Table 3 Accent 5" w:uiPriority="48"/>
+    <w:lsdException w:name="Grid Table 4 Accent 5" w:uiPriority="49"/>
+    <w:lsdException w:name="Grid Table 5 Dark Accent 5" w:uiPriority="50"/>
+    <w:lsdException w:name="Grid Table 6 Colorful Accent 5" w:uiPriority="51"/>
+    <w:lsdException w:name="Grid Table 7 Colorful Accent 5" w:uiPriority="52"/>
+    <w:lsdException w:name="Grid Table 1 Light Accent 6" w:uiPriority="46"/>
+    <w:lsdException w:name="Grid Table 2 Accent 6" w:uiPriority="47"/>
+    <w:lsdException w:name="Grid Table 3 Accent 6" w:uiPriority="48"/>
+    <w:lsdException w:name="Grid Table 4 Accent 6" w:uiPriority="49"/>
+    <w:lsdException w:name="Grid Table 5 Dark Accent 6" w:uiPriority="50"/>
+    <w:lsdException w:name="Grid Table 6 Colorful Accent 6" w:uiPriority="51"/>
+    <w:lsdException w:name="Grid Table 7 Colorful Accent 6" w:uiPriority="52"/>
+    <w:lsdException w:name="List Table 1 Light" w:uiPriority="46"/>
+    <w:lsdException w:name="List Table 2" w:uiPriority="47"/>
+    <w:lsdException w:name="List Table 3" w:uiPriority="48"/>
+    <w:lsdException w:name="List Table 4" w:uiPriority="49"/>
+    <w:lsdException w:name="List Table 5 Dark" w:uiPriority="50"/>
+    <w:lsdException w:name="List Table 6 Colorful" w:uiPriority="51"/>
+    <w:lsdException w:name="List Table 7 Colorful" w:uiPriority="52"/>
+    <w:lsdException w:name="List Table 1 Light Accent 1" w:uiPriority="46"/>
+    <w:lsdException w:name="List Table 2 Accent 1" w:uiPriority="47"/>
+    <w:lsdException w:name="List Table 3 Accent 1" w:uiPriority="48"/>
+    <w:lsdException w:name="List Table 4 Accent 1" w:uiPriority="49"/>
+    <w:lsdException w:name="List Table 5 Dark Accent 1" w:uiPriority="50"/>
+    <w:lsdException w:name="List Table 6 Colorful Accent 1" w:uiPriority="51"/>
+    <w:lsdException w:name="List Table 7 Colorful Accent 1" w:uiPriority="52"/>
+    <w:lsdException w:name="List Table 1 Light Accent 2" w:uiPriority="46"/>
+    <w:lsdException w:name="List Table 2 Accent 2" w:uiPriority="47"/>
+    <w:lsdException w:name="List Table 3 Accent 2" w:uiPriority="48"/>
+    <w:lsdException w:name="List Table 4 Accent 2" w:uiPriority="49"/>
+    <w:lsdException w:name="List Table 5 Dark Accent 2" w:uiPriority="50"/>
+    <w:lsdException w:name="List Table 6 Colorful Accent 2" w:uiPriority="51"/>
+    <w:lsdException w:name="List Table 7 Colorful Accent 2" w:uiPriority="52"/>
+    <w:lsdException w:name="List Table 1 Light Accent 3" w:uiPriority="46"/>
+    <w:lsdException w:name="List Table 2 Accent 3" w:uiPriority="47"/>
+    <w:lsdException w:name="List Table 3 Accent 3" w:uiPriority="48"/>
+    <w:lsdException w:name="List Table 4 Accent 3" w:uiPriority="49"/>
+    <w:lsdException w:name="List Table 5 Dark Accent 3" w:uiPriority="50"/>
+    <w:lsdException w:name="List Table 6 Colorful Accent 3" w:uiPriority="51"/>
+    <w:lsdException w:name="List Table 7 Colorful Accent 3" w:uiPriority="52"/>
+    <w:lsdException w:name="List Table 1 Light Accent 4" w:uiPriority="46"/>
+    <w:lsdException w:name="List Table 2 Accent 4" w:uiPriority="47"/>
+    <w:lsdException w:name="List Table 3 Accent 4" w:uiPriority="48"/>
+    <w:lsdException w:name="List Table 4 Accent 4" w:uiPriority="49"/>
+    <w:lsdException w:name="List Table 5 Dark Accent 4" w:uiPriority="50"/>
+    <w:lsdException w:name="List Table 6 Colorful Accent 4" w:uiPriority="51"/>
+    <w:lsdException w:name="List Table 7 Colorful Accent 4" w:uiPriority="52"/>
+    <w:lsdException w:name="List Table 1 Light Accent 5" w:uiPriority="46"/>
+    <w:lsdException w:name="List Table 2 Accent 5" w:uiPriority="47"/>
+    <w:lsdException w:name="List Table 3 Accent 5" w:uiPriority="48"/>
+    <w:lsdException w:name="List Table 4 Accent 5" w:uiPriority="49"/>
+    <w:lsdException w:name="List Table 5 Dark Accent 5" w:uiPriority="50"/>
+    <w:lsdException w:name="List Table 6 Colorful Accent 5" w:uiPriority="51"/>
+    <w:lsdException w:name="List Table 7 Colorful Accent 5" w:uiPriority="52"/>
+    <w:lsdException w:name="List Table 1 Light Accent 6" w:uiPriority="46"/>
+    <w:lsdException w:name="List Table 2 Accent 6" w:uiPriority="47"/>
+    <w:lsdException w:name="List Table 3 Accent 6" w:uiPriority="48"/>
+    <w:lsdException w:name="List Table 4 Accent 6" w:uiPriority="49"/>
+    <w:lsdException w:name="List Table 5 Dark Accent 6" w:uiPriority="50"/>
+    <w:lsdException w:name="List Table 6 Colorful Accent 6" w:uiPriority="51"/>
+    <w:lsdException w:name="List Table 7 Colorful Accent 6" w:uiPriority="52"/>
+    <w:lsdException w:name="Mention" w:semiHidden="1" w:unhideWhenUsed="1"/>
+    <w:lsdException w:name="Smart Hyperlink" w:semiHidden="1" w:unhideWhenUsed="1"/>
+    <w:lsdException w:name="Hashtag" w:semiHidden="1" w:unhideWhenUsed="1"/>
+    <w:lsdException w:name="Unresolved Mention" w:semiHidden="1" w:unhideWhenUsed="1"/>
+    <w:lsdException w:name="Smart Link" w:semiHidden="1" w:unhideWhenUsed="1"/>
   </w:latentStyles>
   <w:style w:type="paragraph" w:styleId="Normalny" w:default="1">
     <w:name w:val="Normal"/>
@@ -665,7 +1562,6 @@
     <w:uiPriority w:val="99"/>
     <w:semiHidden/>
     <w:unhideWhenUsed/>
-    <w:qFormat/>
     <w:tblPr>
       <w:tblInd w:w="0" w:type="dxa"/>
       <w:tblCellMar>
@@ -682,22 +1578,19 @@
     <w:semiHidden/>
     <w:unhideWhenUsed/>
   </w:style>
-  <w:style w:type="paragraph" w:styleId="ListParagraph">
+  <w:style w:type="paragraph" w:styleId="Akapitzlist">
+    <w:name w:val="List Paragraph"/>
     <w:uiPriority w:val="34"/>
-    <w:name w:val="List Paragraph"/>
-    <w:basedOn w:val="Normal"/>
     <w:qFormat/>
     <w:rsid w:val="1C127662"/>
     <w:pPr>
-      <w:spacing/>
       <w:ind w:left="720"/>
       <w:contextualSpacing/>
     </w:pPr>
   </w:style>
-  <w:style w:type="character" w:styleId="Hyperlink">
+  <w:style w:type="character" w:styleId="Hipercze">
+    <w:name w:val="Hyperlink"/>
     <w:uiPriority w:val="99"/>
-    <w:name w:val="Hyperlink"/>
-    <w:basedOn w:val="DefaultParagraphFont"/>
     <w:unhideWhenUsed/>
     <w:rsid w:val="1C127662"/>
     <w:rPr>

</xml_diff>

<commit_message>
2-osobowe kolko i krzyzyk
</commit_message>
<xml_diff>
--- a/dokumentacja.docx
+++ b/dokumentacja.docx
@@ -2,7 +2,7 @@
 <file path=word/document.xml><?xml version="1.0" encoding="utf-8"?>
 <w:document xmlns:o="urn:schemas-microsoft-com:office:office" xmlns:r="http://schemas.openxmlformats.org/officeDocument/2006/relationships" xmlns:v="urn:schemas-microsoft-com:vml" xmlns:w="http://schemas.openxmlformats.org/wordprocessingml/2006/main" xmlns:w10="urn:schemas-microsoft-com:office:word" xmlns:wp="http://schemas.openxmlformats.org/drawingml/2006/wordprocessingDrawing" xmlns:pic="http://schemas.openxmlformats.org/drawingml/2006/picture" xmlns:wps="http://schemas.microsoft.com/office/word/2010/wordprocessingShape" xmlns:wpg="http://schemas.microsoft.com/office/word/2010/wordprocessingGroup" xmlns:mc="http://schemas.openxmlformats.org/markup-compatibility/2006" xmlns:wp14="http://schemas.microsoft.com/office/word/2010/wordprocessingDrawing" xmlns:w14="http://schemas.microsoft.com/office/word/2010/wordml" xmlns:w15="http://schemas.microsoft.com/office/word/2012/wordml" mc:Ignorable="w14 wp14 w15">
   <w:body>
-    <w:p>
+    <w:p xmlns:wp14="http://schemas.microsoft.com/office/word/2010/wordml" wp14:textId="77777777">
       <w:pPr>
         <w:pStyle w:val="Normal"/>
         <w:rPr/>
@@ -12,7 +12,7 @@
         <w:t>28 maja-  start projektu</w:t>
       </w:r>
     </w:p>
-    <w:p>
+    <w:p xmlns:wp14="http://schemas.microsoft.com/office/word/2010/wordml" wp14:textId="77777777">
       <w:pPr>
         <w:pStyle w:val="Normal"/>
         <w:rPr/>
@@ -22,7 +22,7 @@
         <w:t>Cele:  Moja gra to będzie“Salon Gier”- kilka prostych, klasycznych gier.</w:t>
       </w:r>
     </w:p>
-    <w:p>
+    <w:p xmlns:wp14="http://schemas.microsoft.com/office/word/2010/wordml" wp14:textId="77777777">
       <w:pPr>
         <w:pStyle w:val="Normal"/>
         <w:rPr/>
@@ -32,7 +32,7 @@
         <w:t>Przede wszystkim z:</w:t>
       </w:r>
     </w:p>
-    <w:p>
+    <w:p xmlns:wp14="http://schemas.microsoft.com/office/word/2010/wordml" wp14:textId="77777777">
       <w:pPr>
         <w:pStyle w:val="Normal"/>
         <w:rPr/>
@@ -42,7 +42,7 @@
         <w:t>1. Kółko i krzyżyk</w:t>
       </w:r>
     </w:p>
-    <w:p>
+    <w:p xmlns:wp14="http://schemas.microsoft.com/office/word/2010/wordml" wp14:textId="77777777">
       <w:pPr>
         <w:pStyle w:val="Normal"/>
         <w:rPr/>
@@ -52,7 +52,7 @@
         <w:t>2. Blackjack</w:t>
       </w:r>
     </w:p>
-    <w:p>
+    <w:p xmlns:wp14="http://schemas.microsoft.com/office/word/2010/wordml" wp14:textId="77777777">
       <w:pPr>
         <w:pStyle w:val="Normal"/>
         <w:rPr/>
@@ -62,7 +62,7 @@
         <w:t xml:space="preserve">30 maja – Start pracy nad menu głównym projektu. </w:t>
       </w:r>
     </w:p>
-    <w:p>
+    <w:p xmlns:wp14="http://schemas.microsoft.com/office/word/2010/wordml" wp14:textId="77777777">
       <w:pPr>
         <w:pStyle w:val="ListParagraph"/>
         <w:numPr>
@@ -86,7 +86,7 @@
         </w:r>
       </w:hyperlink>
     </w:p>
-    <w:p>
+    <w:p xmlns:wp14="http://schemas.microsoft.com/office/word/2010/wordml" wp14:textId="77777777">
       <w:pPr>
         <w:pStyle w:val="ListParagraph"/>
         <w:numPr>
@@ -100,7 +100,7 @@
         <w:t>Ukończenie podstawowego menu głównego projektu</w:t>
       </w:r>
     </w:p>
-    <w:p>
+    <w:p xmlns:wp14="http://schemas.microsoft.com/office/word/2010/wordml" wp14:textId="77777777">
       <w:pPr>
         <w:pStyle w:val="Normal"/>
         <w:rPr/>
@@ -110,7 +110,7 @@
         <w:t>31 maja – Dopracowanie menu, start pracy nad kółkiem i krzyżyk</w:t>
       </w:r>
     </w:p>
-    <w:p>
+    <w:p xmlns:wp14="http://schemas.microsoft.com/office/word/2010/wordml" wp14:textId="77777777">
       <w:pPr>
         <w:pStyle w:val="ListParagraph"/>
         <w:rPr/>
@@ -120,7 +120,7 @@
         <w:t>Nauka:</w:t>
       </w:r>
     </w:p>
-    <w:p>
+    <w:p xmlns:wp14="http://schemas.microsoft.com/office/word/2010/wordml" wp14:textId="77777777">
       <w:pPr>
         <w:pStyle w:val="ListParagraph"/>
         <w:rPr>
@@ -144,7 +144,7 @@
         </w:r>
       </w:hyperlink>
     </w:p>
-    <w:p>
+    <w:p xmlns:wp14="http://schemas.microsoft.com/office/word/2010/wordml" wp14:textId="77777777">
       <w:pPr>
         <w:pStyle w:val="ListParagraph"/>
         <w:rPr/>
@@ -180,7 +180,7 @@
         </w:r>
       </w:hyperlink>
     </w:p>
-    <w:p>
+    <w:p xmlns:wp14="http://schemas.microsoft.com/office/word/2010/wordml" wp14:textId="77777777">
       <w:pPr>
         <w:pStyle w:val="ListParagraph"/>
         <w:rPr/>
@@ -190,7 +190,7 @@
         <w:t>- użycie AI do przykładowego wyglądu planszy kółko i krzyżyk</w:t>
       </w:r>
     </w:p>
-    <w:p>
+    <w:p xmlns:wp14="http://schemas.microsoft.com/office/word/2010/wordml" wp14:textId="77777777">
       <w:pPr>
         <w:pStyle w:val="ListParagraph"/>
         <w:rPr/>
@@ -200,7 +200,7 @@
         <w:t xml:space="preserve">(Odpowiedź - </w:t>
       </w:r>
     </w:p>
-    <w:p>
+    <w:p xmlns:wp14="http://schemas.microsoft.com/office/word/2010/wordml" wp14:textId="77777777">
       <w:pPr>
         <w:pStyle w:val="ListParagraph"/>
         <w:rPr/>
@@ -214,7 +214,7 @@
         <w:t>1   2   3</w:t>
       </w:r>
     </w:p>
-    <w:p>
+    <w:p xmlns:wp14="http://schemas.microsoft.com/office/word/2010/wordml" wp14:textId="77777777">
       <w:pPr>
         <w:pStyle w:val="ListParagraph"/>
         <w:rPr/>
@@ -228,7 +228,7 @@
         <w:t>+---+---+---+</w:t>
       </w:r>
     </w:p>
-    <w:p>
+    <w:p xmlns:wp14="http://schemas.microsoft.com/office/word/2010/wordml" wp14:textId="77777777">
       <w:pPr>
         <w:pStyle w:val="ListParagraph"/>
         <w:rPr/>
@@ -242,7 +242,7 @@
         <w:t>1 | - | - | - |</w:t>
       </w:r>
     </w:p>
-    <w:p>
+    <w:p xmlns:wp14="http://schemas.microsoft.com/office/word/2010/wordml" wp14:textId="77777777">
       <w:pPr>
         <w:pStyle w:val="ListParagraph"/>
         <w:rPr/>
@@ -256,7 +256,7 @@
         <w:t>+---+---+---+</w:t>
       </w:r>
     </w:p>
-    <w:p>
+    <w:p xmlns:wp14="http://schemas.microsoft.com/office/word/2010/wordml" wp14:textId="77777777">
       <w:pPr>
         <w:pStyle w:val="ListParagraph"/>
         <w:rPr/>
@@ -270,7 +270,7 @@
         <w:t>2 | - | - | - |</w:t>
       </w:r>
     </w:p>
-    <w:p>
+    <w:p xmlns:wp14="http://schemas.microsoft.com/office/word/2010/wordml" wp14:textId="77777777">
       <w:pPr>
         <w:pStyle w:val="ListParagraph"/>
         <w:rPr/>
@@ -284,7 +284,7 @@
         <w:t>+---+---+---+</w:t>
       </w:r>
     </w:p>
-    <w:p>
+    <w:p xmlns:wp14="http://schemas.microsoft.com/office/word/2010/wordml" wp14:textId="77777777">
       <w:pPr>
         <w:pStyle w:val="ListParagraph"/>
         <w:rPr/>
@@ -298,7 +298,7 @@
         <w:t>3 | - | - | - |</w:t>
       </w:r>
     </w:p>
-    <w:p>
+    <w:p xmlns:wp14="http://schemas.microsoft.com/office/word/2010/wordml" wp14:textId="77777777">
       <w:pPr>
         <w:pStyle w:val="ListParagraph"/>
         <w:rPr/>
@@ -312,7 +312,7 @@
         <w:t>+---+---+---+ )</w:t>
       </w:r>
     </w:p>
-    <w:p>
+    <w:p xmlns:wp14="http://schemas.microsoft.com/office/word/2010/wordml" wp14:textId="77777777">
       <w:pPr>
         <w:pStyle w:val="ListParagraph"/>
         <w:numPr>
@@ -326,123 +326,169 @@
         <w:t>Ukończenie funkcji wypisania tablicy kółko i krzyżyk</w:t>
       </w:r>
     </w:p>
+    <w:p xmlns:wp14="http://schemas.microsoft.com/office/word/2010/wordml" wp14:textId="77777777">
+      <w:pPr>
+        <w:pStyle w:val="Normal"/>
+        <w:rPr/>
+      </w:pPr>
+      <w:r>
+        <w:rPr/>
+        <w:t>3 czerwca-</w:t>
+      </w:r>
+    </w:p>
+    <w:p xmlns:wp14="http://schemas.microsoft.com/office/word/2010/wordml" wp14:textId="77777777">
+      <w:pPr>
+        <w:pStyle w:val="Normal"/>
+        <w:rPr/>
+      </w:pPr>
+      <w:r>
+        <w:rPr/>
+        <w:t xml:space="preserve">funkcja ai_kolko- ruch „ai” i „ruch gracza” dla wyboru kółka </w:t>
+      </w:r>
+    </w:p>
+    <w:p xmlns:wp14="http://schemas.microsoft.com/office/word/2010/wordml" wp14:textId="77777777">
+      <w:pPr>
+        <w:pStyle w:val="Normal"/>
+        <w:rPr/>
+      </w:pPr>
+      <w:r>
+        <w:rPr/>
+        <w:t>5 czerwca-</w:t>
+      </w:r>
+    </w:p>
+    <w:p xmlns:wp14="http://schemas.microsoft.com/office/word/2010/wordml" wp14:textId="77777777">
+      <w:pPr>
+        <w:pStyle w:val="Normal"/>
+        <w:rPr/>
+      </w:pPr>
+      <w:r>
+        <w:rPr/>
+        <w:t>Ukónczenie gry kółko i krzyżyk</w:t>
+      </w:r>
+    </w:p>
+    <w:p xmlns:wp14="http://schemas.microsoft.com/office/word/2010/wordml" wp14:textId="77777777">
+      <w:pPr>
+        <w:pStyle w:val="Normal"/>
+        <w:rPr/>
+      </w:pPr>
+      <w:r>
+        <w:rPr/>
+        <w:t>10 czerwca-</w:t>
+      </w:r>
+    </w:p>
+    <w:p xmlns:wp14="http://schemas.microsoft.com/office/word/2010/wordml" wp14:textId="77777777">
+      <w:pPr>
+        <w:pStyle w:val="Normal"/>
+        <w:rPr/>
+      </w:pPr>
+      <w:r>
+        <w:rPr/>
+        <w:t>Rozpoczęcie prac nad blackjackiem</w:t>
+      </w:r>
+    </w:p>
+    <w:p xmlns:wp14="http://schemas.microsoft.com/office/word/2010/wordml" wp14:textId="77777777">
+      <w:pPr>
+        <w:pStyle w:val="Normal"/>
+        <w:rPr/>
+      </w:pPr>
+      <w:r>
+        <w:rPr/>
+        <w:t>13 czerwca-</w:t>
+      </w:r>
+    </w:p>
+    <w:p xmlns:wp14="http://schemas.microsoft.com/office/word/2010/wordml" wp14:textId="77777777">
+      <w:pPr>
+        <w:pStyle w:val="Normal"/>
+        <w:rPr/>
+      </w:pPr>
+      <w:r>
+        <w:rPr/>
+        <w:t>ukończenie prac nad blackjackiem</w:t>
+      </w:r>
+    </w:p>
+    <w:p xmlns:wp14="http://schemas.microsoft.com/office/word/2010/wordml" wp14:textId="77777777">
+      <w:pPr>
+        <w:pStyle w:val="Normal"/>
+        <w:rPr/>
+      </w:pPr>
+      <w:r>
+        <w:rPr/>
+        <w:t>14 czerwca-  nauka tablic dynamicznych:</w:t>
+      </w:r>
+    </w:p>
+    <w:p xmlns:wp14="http://schemas.microsoft.com/office/word/2010/wordml" wp14:textId="77777777">
+      <w:pPr>
+        <w:pStyle w:val="Normal"/>
+      </w:pPr>
+      <w:hyperlink r:id="Rd25659dc82bc40ef">
+        <w:r>
+          <w:rPr>
+            <w:rStyle w:val="Hyperlink"/>
+          </w:rPr>
+          <w:t>https://www.youtube.com/watch?v=PocJ5jXv8No</w:t>
+        </w:r>
+      </w:hyperlink>
+    </w:p>
     <w:p>
       <w:pPr>
         <w:pStyle w:val="Normal"/>
-        <w:rPr/>
-      </w:pPr>
-      <w:r>
-        <w:rPr/>
-        <w:t>3 czerwca-</w:t>
+      </w:pPr>
+      <w:r>
+        <w:rPr/>
+        <w:t>2 września- dodanie 2osobowego kółka i krzyżyk</w:t>
       </w:r>
     </w:p>
     <w:p>
       <w:pPr>
         <w:pStyle w:val="Normal"/>
-        <w:rPr/>
-      </w:pPr>
-      <w:r>
-        <w:rPr/>
-        <w:t xml:space="preserve">funkcja ai_kolko- ruch „ai” i „ruch gracza” dla wyboru kółka </w:t>
-      </w:r>
-    </w:p>
-    <w:p>
-      <w:pPr>
-        <w:pStyle w:val="Normal"/>
-        <w:rPr/>
-      </w:pPr>
-      <w:r>
-        <w:rPr/>
-        <w:t>5 czerwca-</w:t>
-      </w:r>
-    </w:p>
-    <w:p>
-      <w:pPr>
-        <w:pStyle w:val="Normal"/>
-        <w:rPr/>
-      </w:pPr>
-      <w:r>
-        <w:rPr/>
-        <w:t>Ukónczenie gry kółko i krzyżyk</w:t>
-      </w:r>
-    </w:p>
-    <w:p>
-      <w:pPr>
-        <w:pStyle w:val="Normal"/>
-        <w:rPr/>
-      </w:pPr>
-      <w:r>
-        <w:rPr/>
-        <w:t>10 czerwca-</w:t>
-      </w:r>
-    </w:p>
-    <w:p>
-      <w:pPr>
-        <w:pStyle w:val="Normal"/>
-        <w:rPr/>
-      </w:pPr>
-      <w:r>
-        <w:rPr/>
-        <w:t>Rozpoczęcie prac nad blackjackiem</w:t>
-      </w:r>
-    </w:p>
-    <w:p>
-      <w:pPr>
-        <w:pStyle w:val="Normal"/>
-        <w:rPr/>
-      </w:pPr>
-      <w:r>
-        <w:rPr/>
-        <w:t>13 czerwca-</w:t>
-      </w:r>
-    </w:p>
-    <w:p>
-      <w:pPr>
-        <w:pStyle w:val="Normal"/>
-        <w:rPr/>
-      </w:pPr>
-      <w:r>
-        <w:rPr/>
-        <w:t>ukończenie prac nad blackjackiem</w:t>
-      </w:r>
-    </w:p>
-    <w:p>
-      <w:pPr>
-        <w:pStyle w:val="Normal"/>
-        <w:rPr/>
-      </w:pPr>
-      <w:r>
-        <w:rPr/>
-      </w:r>
-    </w:p>
-    <w:p>
-      <w:pPr>
-        <w:pStyle w:val="ListParagraph"/>
-        <w:rPr/>
-      </w:pPr>
-      <w:r>
-        <w:rPr/>
-      </w:r>
-    </w:p>
-    <w:p>
-      <w:pPr>
-        <w:pStyle w:val="ListParagraph"/>
-        <w:rPr/>
-      </w:pPr>
-      <w:r>
-        <w:rPr/>
-      </w:r>
-    </w:p>
-    <w:p>
-      <w:pPr>
-        <w:pStyle w:val="ListParagraph"/>
-        <w:rPr/>
-      </w:pPr>
-      <w:r>
-        <w:rPr/>
-      </w:r>
-    </w:p>
-    <w:p>
+      </w:pPr>
+    </w:p>
+    <w:p xmlns:wp14="http://schemas.microsoft.com/office/word/2010/wordml" wp14:textId="77777777">
+      <w:pPr>
+        <w:pStyle w:val="Normal"/>
+        <w:rPr/>
+      </w:pPr>
+      <w:r>
+        <w:rPr/>
+      </w:r>
+    </w:p>
+    <w:p xmlns:wp14="http://schemas.microsoft.com/office/word/2010/wordml" wp14:textId="77777777">
+      <w:pPr>
+        <w:pStyle w:val="Normal"/>
+        <w:rPr/>
+      </w:pPr>
+      <w:r>
+        <w:rPr/>
+      </w:r>
+    </w:p>
+    <w:p xmlns:wp14="http://schemas.microsoft.com/office/word/2010/wordml" wp14:textId="77777777">
+      <w:pPr>
+        <w:pStyle w:val="ListParagraph"/>
+        <w:rPr/>
+      </w:pPr>
+      <w:r>
+        <w:rPr/>
+      </w:r>
+    </w:p>
+    <w:p xmlns:wp14="http://schemas.microsoft.com/office/word/2010/wordml" wp14:textId="77777777">
+      <w:pPr>
+        <w:pStyle w:val="ListParagraph"/>
+        <w:rPr/>
+      </w:pPr>
+      <w:r>
+        <w:rPr/>
+      </w:r>
+    </w:p>
+    <w:p xmlns:wp14="http://schemas.microsoft.com/office/word/2010/wordml" wp14:textId="77777777">
+      <w:pPr>
+        <w:pStyle w:val="ListParagraph"/>
+        <w:rPr/>
+      </w:pPr>
+      <w:r>
+        <w:rPr/>
+      </w:r>
+    </w:p>
+    <w:p xmlns:wp14="http://schemas.microsoft.com/office/word/2010/wordml" wp14:textId="77777777">
       <w:pPr>
         <w:pStyle w:val="Normal"/>
         <w:ind w:left="720"/>
@@ -452,7 +498,7 @@
         <w:rPr/>
       </w:r>
     </w:p>
-    <w:p>
+    <w:p xmlns:wp14="http://schemas.microsoft.com/office/word/2010/wordml" wp14:textId="77777777">
       <w:pPr>
         <w:pStyle w:val="Normal"/>
         <w:ind w:left="708"/>
@@ -462,25 +508,25 @@
         <w:rPr/>
       </w:r>
     </w:p>
-    <w:p>
-      <w:pPr>
-        <w:pStyle w:val="Normal"/>
-        <w:rPr/>
-      </w:pPr>
-      <w:r>
-        <w:rPr/>
-      </w:r>
-    </w:p>
-    <w:p>
-      <w:pPr>
-        <w:pStyle w:val="Normal"/>
-        <w:rPr/>
-      </w:pPr>
-      <w:r>
-        <w:rPr/>
-      </w:r>
-    </w:p>
-    <w:p>
+    <w:p xmlns:wp14="http://schemas.microsoft.com/office/word/2010/wordml" wp14:textId="77777777">
+      <w:pPr>
+        <w:pStyle w:val="Normal"/>
+        <w:rPr/>
+      </w:pPr>
+      <w:r>
+        <w:rPr/>
+      </w:r>
+    </w:p>
+    <w:p xmlns:wp14="http://schemas.microsoft.com/office/word/2010/wordml" wp14:textId="77777777">
+      <w:pPr>
+        <w:pStyle w:val="Normal"/>
+        <w:rPr/>
+      </w:pPr>
+      <w:r>
+        <w:rPr/>
+      </w:r>
+    </w:p>
+    <w:p xmlns:wp14="http://schemas.microsoft.com/office/word/2010/wordml" wp14:textId="77777777">
       <w:pPr>
         <w:pStyle w:val="Normal"/>
         <w:ind w:left="708"/>
@@ -490,7 +536,7 @@
         <w:rPr/>
       </w:r>
     </w:p>
-    <w:p>
+    <w:p xmlns:wp14="http://schemas.microsoft.com/office/word/2010/wordml" wp14:textId="77777777">
       <w:pPr>
         <w:pStyle w:val="Normal"/>
         <w:ind w:left="708"/>
@@ -500,12 +546,12 @@
         <w:rPr/>
       </w:r>
     </w:p>
-    <w:p>
+    <w:p xmlns:wp14="http://schemas.microsoft.com/office/word/2010/wordml" wp14:textId="77777777">
       <w:pPr>
         <w:pStyle w:val="ListParagraph"/>
         <w:widowControl/>
         <w:bidi w:val="0"/>
-        <w:spacing w:lineRule="auto" w:line="276" w:before="0" w:after="200"/>
+        <w:spacing w:before="0" w:after="200" w:line="276" w:lineRule="auto"/>
         <w:ind w:left="720"/>
         <w:contextualSpacing/>
         <w:jc w:val="left"/>
@@ -517,12 +563,13 @@
     </w:p>
     <w:sectPr>
       <w:type w:val="nextPage"/>
-      <w:pgSz w:w="11906" w:h="16838"/>
-      <w:pgMar w:left="1417" w:right="1417" w:gutter="0" w:header="0" w:top="1417" w:footer="0" w:bottom="1417"/>
+      <w:pgSz w:w="11906" w:h="16838" w:orient="portrait"/>
+      <w:pgMar w:top="1417" w:right="1417" w:bottom="1417" w:left="1417" w:header="0" w:footer="0" w:gutter="0"/>
       <w:pgNumType w:fmt="decimal"/>
       <w:formProt w:val="false"/>
       <w:textDirection w:val="lrTb"/>
       <w:docGrid w:type="default" w:linePitch="360" w:charSpace="0"/>
+      <w:cols w:num="1"/>
     </w:sectPr>
   </w:body>
 </w:document>
@@ -543,7 +590,7 @@
         <w:ind w:left="1080" w:hanging="360"/>
       </w:pPr>
       <w:rPr>
-        <w:rFonts w:ascii="Aptos" w:hAnsi="Aptos" w:cs="Aptos" w:hint="default"/>
+        <w:rFonts w:hint="default" w:ascii="Aptos" w:hAnsi="Aptos" w:cs="Aptos"/>
       </w:rPr>
     </w:lvl>
     <w:lvl w:ilvl="1">
@@ -558,7 +605,7 @@
         <w:ind w:left="1800" w:hanging="360"/>
       </w:pPr>
       <w:rPr>
-        <w:rFonts w:ascii="Courier New" w:hAnsi="Courier New" w:cs="Courier New" w:hint="default"/>
+        <w:rFonts w:hint="default" w:ascii="Courier New" w:hAnsi="Courier New" w:cs="Courier New"/>
       </w:rPr>
     </w:lvl>
     <w:lvl w:ilvl="2">
@@ -573,7 +620,7 @@
         <w:ind w:left="2520" w:hanging="360"/>
       </w:pPr>
       <w:rPr>
-        <w:rFonts w:ascii="Wingdings" w:hAnsi="Wingdings" w:cs="Wingdings" w:hint="default"/>
+        <w:rFonts w:hint="default" w:ascii="Wingdings" w:hAnsi="Wingdings" w:cs="Wingdings"/>
       </w:rPr>
     </w:lvl>
     <w:lvl w:ilvl="3">
@@ -588,7 +635,7 @@
         <w:ind w:left="3240" w:hanging="360"/>
       </w:pPr>
       <w:rPr>
-        <w:rFonts w:ascii="Symbol" w:hAnsi="Symbol" w:cs="Symbol" w:hint="default"/>
+        <w:rFonts w:hint="default" w:ascii="Symbol" w:hAnsi="Symbol" w:cs="Symbol"/>
       </w:rPr>
     </w:lvl>
     <w:lvl w:ilvl="4">
@@ -603,7 +650,7 @@
         <w:ind w:left="3960" w:hanging="360"/>
       </w:pPr>
       <w:rPr>
-        <w:rFonts w:ascii="Courier New" w:hAnsi="Courier New" w:cs="Courier New" w:hint="default"/>
+        <w:rFonts w:hint="default" w:ascii="Courier New" w:hAnsi="Courier New" w:cs="Courier New"/>
       </w:rPr>
     </w:lvl>
     <w:lvl w:ilvl="5">
@@ -618,7 +665,7 @@
         <w:ind w:left="4680" w:hanging="360"/>
       </w:pPr>
       <w:rPr>
-        <w:rFonts w:ascii="Wingdings" w:hAnsi="Wingdings" w:cs="Wingdings" w:hint="default"/>
+        <w:rFonts w:hint="default" w:ascii="Wingdings" w:hAnsi="Wingdings" w:cs="Wingdings"/>
       </w:rPr>
     </w:lvl>
     <w:lvl w:ilvl="6">
@@ -633,7 +680,7 @@
         <w:ind w:left="5400" w:hanging="360"/>
       </w:pPr>
       <w:rPr>
-        <w:rFonts w:ascii="Symbol" w:hAnsi="Symbol" w:cs="Symbol" w:hint="default"/>
+        <w:rFonts w:hint="default" w:ascii="Symbol" w:hAnsi="Symbol" w:cs="Symbol"/>
       </w:rPr>
     </w:lvl>
     <w:lvl w:ilvl="7">
@@ -648,7 +695,7 @@
         <w:ind w:left="6120" w:hanging="360"/>
       </w:pPr>
       <w:rPr>
-        <w:rFonts w:ascii="Courier New" w:hAnsi="Courier New" w:cs="Courier New" w:hint="default"/>
+        <w:rFonts w:hint="default" w:ascii="Courier New" w:hAnsi="Courier New" w:cs="Courier New"/>
       </w:rPr>
     </w:lvl>
     <w:lvl w:ilvl="8">
@@ -663,9 +710,10 @@
         <w:ind w:left="6840" w:hanging="360"/>
       </w:pPr>
       <w:rPr>
-        <w:rFonts w:ascii="Wingdings" w:hAnsi="Wingdings" w:cs="Wingdings" w:hint="default"/>
-      </w:rPr>
-    </w:lvl>
+        <w:rFonts w:hint="default" w:ascii="Wingdings" w:hAnsi="Wingdings" w:cs="Wingdings"/>
+      </w:rPr>
+    </w:lvl>
+    <w:nsid w:val="5f443416"/>
   </w:abstractNum>
   <w:abstractNum w:abstractNumId="2">
     <w:lvl w:ilvl="0">
@@ -680,7 +728,7 @@
         <w:ind w:left="720" w:hanging="360"/>
       </w:pPr>
       <w:rPr>
-        <w:rFonts w:ascii="Aptos" w:hAnsi="Aptos" w:cs="Aptos" w:hint="default"/>
+        <w:rFonts w:hint="default" w:ascii="Aptos" w:hAnsi="Aptos" w:cs="Aptos"/>
       </w:rPr>
     </w:lvl>
     <w:lvl w:ilvl="1">
@@ -695,7 +743,7 @@
         <w:ind w:left="1440" w:hanging="360"/>
       </w:pPr>
       <w:rPr>
-        <w:rFonts w:ascii="Courier New" w:hAnsi="Courier New" w:cs="Courier New" w:hint="default"/>
+        <w:rFonts w:hint="default" w:ascii="Courier New" w:hAnsi="Courier New" w:cs="Courier New"/>
       </w:rPr>
     </w:lvl>
     <w:lvl w:ilvl="2">
@@ -710,7 +758,7 @@
         <w:ind w:left="2160" w:hanging="360"/>
       </w:pPr>
       <w:rPr>
-        <w:rFonts w:ascii="Wingdings" w:hAnsi="Wingdings" w:cs="Wingdings" w:hint="default"/>
+        <w:rFonts w:hint="default" w:ascii="Wingdings" w:hAnsi="Wingdings" w:cs="Wingdings"/>
       </w:rPr>
     </w:lvl>
     <w:lvl w:ilvl="3">
@@ -725,7 +773,7 @@
         <w:ind w:left="2880" w:hanging="360"/>
       </w:pPr>
       <w:rPr>
-        <w:rFonts w:ascii="Symbol" w:hAnsi="Symbol" w:cs="Symbol" w:hint="default"/>
+        <w:rFonts w:hint="default" w:ascii="Symbol" w:hAnsi="Symbol" w:cs="Symbol"/>
       </w:rPr>
     </w:lvl>
     <w:lvl w:ilvl="4">
@@ -740,7 +788,7 @@
         <w:ind w:left="3600" w:hanging="360"/>
       </w:pPr>
       <w:rPr>
-        <w:rFonts w:ascii="Courier New" w:hAnsi="Courier New" w:cs="Courier New" w:hint="default"/>
+        <w:rFonts w:hint="default" w:ascii="Courier New" w:hAnsi="Courier New" w:cs="Courier New"/>
       </w:rPr>
     </w:lvl>
     <w:lvl w:ilvl="5">
@@ -755,7 +803,7 @@
         <w:ind w:left="4320" w:hanging="360"/>
       </w:pPr>
       <w:rPr>
-        <w:rFonts w:ascii="Wingdings" w:hAnsi="Wingdings" w:cs="Wingdings" w:hint="default"/>
+        <w:rFonts w:hint="default" w:ascii="Wingdings" w:hAnsi="Wingdings" w:cs="Wingdings"/>
       </w:rPr>
     </w:lvl>
     <w:lvl w:ilvl="6">
@@ -770,7 +818,7 @@
         <w:ind w:left="5040" w:hanging="360"/>
       </w:pPr>
       <w:rPr>
-        <w:rFonts w:ascii="Symbol" w:hAnsi="Symbol" w:cs="Symbol" w:hint="default"/>
+        <w:rFonts w:hint="default" w:ascii="Symbol" w:hAnsi="Symbol" w:cs="Symbol"/>
       </w:rPr>
     </w:lvl>
     <w:lvl w:ilvl="7">
@@ -785,7 +833,7 @@
         <w:ind w:left="5760" w:hanging="360"/>
       </w:pPr>
       <w:rPr>
-        <w:rFonts w:ascii="Courier New" w:hAnsi="Courier New" w:cs="Courier New" w:hint="default"/>
+        <w:rFonts w:hint="default" w:ascii="Courier New" w:hAnsi="Courier New" w:cs="Courier New"/>
       </w:rPr>
     </w:lvl>
     <w:lvl w:ilvl="8">
@@ -800,9 +848,10 @@
         <w:ind w:left="6480" w:hanging="360"/>
       </w:pPr>
       <w:rPr>
-        <w:rFonts w:ascii="Wingdings" w:hAnsi="Wingdings" w:cs="Wingdings" w:hint="default"/>
-      </w:rPr>
-    </w:lvl>
+        <w:rFonts w:hint="default" w:ascii="Wingdings" w:hAnsi="Wingdings" w:cs="Wingdings"/>
+      </w:rPr>
+    </w:lvl>
+    <w:nsid w:val="10d9db1b"/>
   </w:abstractNum>
   <w:abstractNum w:abstractNumId="3">
     <w:lvl w:ilvl="0">
@@ -922,6 +971,7 @@
         <w:ind w:left="0" w:hanging="0"/>
       </w:pPr>
     </w:lvl>
+    <w:nsid w:val="2167857e"/>
   </w:abstractNum>
   <w:num w:numId="1">
     <w:abstractNumId w:val="1"/>
@@ -936,11 +986,11 @@
 </file>
 
 <file path=word/styles.xml><?xml version="1.0" encoding="utf-8"?>
-<w:styles xmlns:w="http://schemas.openxmlformats.org/wordprocessingml/2006/main" xmlns:w14="http://schemas.microsoft.com/office/word/2010/wordml" xmlns:mc="http://schemas.openxmlformats.org/markup-compatibility/2006" mc:Ignorable="w14">
+<w:styles xmlns:wp14="http://schemas.microsoft.com/office/word/2010/wordprocessingDrawing" xmlns:w="http://schemas.openxmlformats.org/wordprocessingml/2006/main" xmlns:w14="http://schemas.microsoft.com/office/word/2010/wordml" xmlns:mc="http://schemas.openxmlformats.org/markup-compatibility/2006" mc:Ignorable="w14 wp14">
   <w:docDefaults>
     <w:rPrDefault>
       <w:rPr>
-        <w:rFonts w:ascii="Calibri" w:hAnsi="Calibri" w:eastAsia="" w:cs="" w:asciiTheme="minorHAnsi" w:cstheme="minorBidi" w:eastAsiaTheme="minorEastAsia" w:hAnsiTheme="minorHAnsi"/>
+        <w:rFonts w:ascii="Calibri" w:hAnsi="Calibri" w:eastAsia="" w:cs="" w:asciiTheme="minorHAnsi" w:hAnsiTheme="minorHAnsi" w:eastAsiaTheme="minorEastAsia" w:cstheme="minorBidi"/>
         <w:sz w:val="22"/>
         <w:szCs w:val="22"/>
         <w:lang w:val="pl-PL" w:eastAsia="pl-PL" w:bidi="ar-SA"/>
@@ -1097,12 +1147,13 @@
     <w:rsid w:val="007f1fed"/>
     <w:pPr>
       <w:widowControl/>
+      <w:suppressAutoHyphens w:val="true"/>
       <w:bidi w:val="0"/>
-      <w:spacing w:lineRule="auto" w:line="276" w:before="0" w:after="200"/>
+      <w:spacing w:before="0" w:after="200" w:line="276" w:lineRule="auto"/>
       <w:jc w:val="left"/>
     </w:pPr>
     <w:rPr>
-      <w:rFonts w:ascii="Calibri" w:hAnsi="Calibri" w:eastAsia="" w:cs="" w:asciiTheme="minorHAnsi" w:cstheme="minorBidi" w:eastAsiaTheme="minorEastAsia" w:hAnsiTheme="minorHAnsi"/>
+      <w:rFonts w:ascii="Calibri" w:hAnsi="Calibri" w:eastAsia="" w:cs="" w:asciiTheme="minorHAnsi" w:hAnsiTheme="minorHAnsi" w:eastAsiaTheme="minorEastAsia" w:cstheme="minorBidi"/>
       <w:color w:val="auto"/>
       <w:kern w:val="0"/>
       <w:sz w:val="22"/>
@@ -1147,7 +1198,7 @@
     <w:name w:val="Body Text"/>
     <w:basedOn w:val="Normal"/>
     <w:pPr>
-      <w:spacing w:lineRule="auto" w:line="276" w:before="0" w:after="140"/>
+      <w:spacing w:before="0" w:after="140" w:line="276" w:lineRule="auto"/>
     </w:pPr>
     <w:rPr/>
   </w:style>
@@ -1186,6 +1237,32 @@
       <w:rFonts w:cs="Lucida Sans"/>
     </w:rPr>
   </w:style>
+  <w:style w:type="paragraph" w:styleId="Nagwekuser">
+    <w:name w:val="Nagłówek (user)"/>
+    <w:basedOn w:val="Normal"/>
+    <w:next w:val="BodyText"/>
+    <w:qFormat/>
+    <w:pPr>
+      <w:keepNext w:val="true"/>
+      <w:spacing w:before="240" w:after="120"/>
+    </w:pPr>
+    <w:rPr>
+      <w:rFonts w:ascii="Liberation Sans" w:hAnsi="Liberation Sans" w:eastAsia="Microsoft YaHei" w:cs="Lucida Sans"/>
+      <w:sz w:val="28"/>
+      <w:szCs w:val="28"/>
+    </w:rPr>
+  </w:style>
+  <w:style w:type="paragraph" w:styleId="Indeksuser">
+    <w:name w:val="Indeks (user)"/>
+    <w:basedOn w:val="Normal"/>
+    <w:qFormat/>
+    <w:pPr>
+      <w:suppressLineNumbers/>
+    </w:pPr>
+    <w:rPr>
+      <w:rFonts w:cs="Lucida Sans"/>
+    </w:rPr>
+  </w:style>
   <w:style w:type="paragraph" w:styleId="ListParagraph">
     <w:name w:val="List Paragraph"/>
     <w:uiPriority w:val="34"/>
@@ -1193,14 +1270,15 @@
     <w:rsid w:val="1c127662"/>
     <w:pPr>
       <w:widowControl/>
+      <w:suppressAutoHyphens w:val="true"/>
       <w:bidi w:val="0"/>
-      <w:spacing w:lineRule="auto" w:line="276" w:before="0" w:after="200"/>
+      <w:spacing w:before="0" w:after="200" w:line="276" w:lineRule="auto"/>
       <w:ind w:left="720"/>
       <w:contextualSpacing/>
       <w:jc w:val="left"/>
     </w:pPr>
     <w:rPr>
-      <w:rFonts w:ascii="Calibri" w:hAnsi="Calibri" w:eastAsia="" w:cs="" w:asciiTheme="minorHAnsi" w:cstheme="minorBidi" w:eastAsiaTheme="minorEastAsia" w:hAnsiTheme="minorHAnsi"/>
+      <w:rFonts w:ascii="Calibri" w:hAnsi="Calibri" w:eastAsia="" w:cs="" w:asciiTheme="minorHAnsi" w:hAnsiTheme="minorHAnsi" w:eastAsiaTheme="minorEastAsia" w:cstheme="minorBidi"/>
       <w:color w:val="auto"/>
       <w:kern w:val="0"/>
       <w:sz w:val="22"/>
@@ -1208,14 +1286,14 @@
       <w:lang w:val="pl-PL" w:eastAsia="pl-PL" w:bidi="ar-SA"/>
     </w:rPr>
   </w:style>
-  <w:style w:type="numbering" w:styleId="Bezlisty" w:default="1">
-    <w:name w:val="Bez listy"/>
+  <w:style w:type="numbering" w:styleId="Bezlistyuser" w:default="1">
+    <w:name w:val="Bez listy (user)"/>
     <w:uiPriority w:val="99"/>
     <w:semiHidden/>
     <w:unhideWhenUsed/>
     <w:qFormat/>
   </w:style>
-  <w:style w:type="table" w:default="1" w:styleId="Standardowy">
+  <w:style w:type="table" w:styleId="Standardowy" w:default="1">
     <w:name w:val="Normal Table"/>
     <w:uiPriority w:val="99"/>
     <w:semiHidden/>

</xml_diff>